<commit_message>
vault backup: 2025-09-27 13:04:12
</commit_message>
<xml_diff>
--- a/学校/文件/刘非凡-文献综述 .docx
+++ b/学校/文件/刘非凡-文献综述 .docx
@@ -259,7 +259,7 @@
         <w:spacing w:line="360" w:lineRule="auto"/>
         <w:ind w:firstLineChars="250" w:firstLine="1043"/>
         <w:rPr>
-          <w:rFonts w:ascii="宋体" w:hAnsi="宋体"/>
+          <w:rFonts w:ascii="宋体" w:hAnsi="宋体" w:hint="eastAsia"/>
           <w:color w:val="000000" w:themeColor="text1"/>
           <w:spacing w:val="68"/>
           <w:sz w:val="28"/>
@@ -274,7 +274,18 @@
           <w:spacing w:val="68"/>
           <w:sz w:val="28"/>
         </w:rPr>
-        <w:t>论文题目</w:t>
+        <w:t>论文</w:t>
+      </w:r>
+      <w:proofErr w:type="gramStart"/>
+      <w:r>
+        <w:rPr>
+          <w:rFonts w:ascii="宋体" w:hAnsi="宋体" w:hint="eastAsia"/>
+          <w:b/>
+          <w:color w:val="000000" w:themeColor="text1"/>
+          <w:spacing w:val="68"/>
+          <w:sz w:val="28"/>
+        </w:rPr>
+        <w:t>题目</w:t>
       </w:r>
       <w:r>
         <w:rPr>
@@ -324,6 +335,7 @@
         </w:rPr>
         <w:t>于</w:t>
       </w:r>
+      <w:proofErr w:type="gramEnd"/>
       <w:r>
         <w:rPr>
           <w:rFonts w:hint="eastAsia"/>
@@ -331,24 +343,25 @@
           <w:sz w:val="28"/>
           <w:u w:val="single"/>
         </w:rPr>
-        <w:t>SF</w:t>
-      </w:r>
-      <w:r>
-        <w:rPr>
-          <w:rFonts w:hint="eastAsia"/>
+        <w:t>YOLOv12</w:t>
+      </w:r>
+      <w:r>
+        <w:rPr>
+          <w:rFonts w:ascii="宋体" w:hAnsi="宋体" w:hint="eastAsia"/>
           <w:kern w:val="0"/>
           <w:sz w:val="28"/>
           <w:u w:val="single"/>
         </w:rPr>
-        <w:t>E</w:t>
-      </w:r>
-      <w:r>
-        <w:rPr>
+        <w:t>的</w:t>
+      </w:r>
+      <w:r>
+        <w:rPr>
+          <w:rFonts w:ascii="宋体" w:hAnsi="宋体" w:hint="eastAsia"/>
           <w:kern w:val="0"/>
           <w:sz w:val="28"/>
           <w:u w:val="single"/>
         </w:rPr>
-        <w:t>N</w:t>
+        <w:t>道路病害检测方法</w:t>
       </w:r>
       <w:r>
         <w:rPr>
@@ -357,7 +370,7 @@
           <w:sz w:val="28"/>
           <w:u w:val="single"/>
         </w:rPr>
-        <w:t>的显著性目标检测研究</w:t>
+        <w:t>研究</w:t>
       </w:r>
       <w:r>
         <w:rPr>
@@ -408,7 +421,7 @@
         <w:spacing w:line="360" w:lineRule="auto"/>
         <w:ind w:firstLineChars="300" w:firstLine="1053"/>
         <w:rPr>
-          <w:rFonts w:ascii="宋体" w:hAnsi="宋体"/>
+          <w:rFonts w:ascii="宋体" w:hAnsi="宋体" w:hint="eastAsia"/>
           <w:color w:val="000000" w:themeColor="text1"/>
           <w:spacing w:val="1000"/>
           <w:w w:val="200"/>
@@ -539,7 +552,7 @@
         <w:spacing w:line="360" w:lineRule="auto"/>
         <w:ind w:firstLineChars="231" w:firstLine="1079"/>
         <w:rPr>
-          <w:rFonts w:ascii="宋体" w:hAnsi="宋体"/>
+          <w:rFonts w:ascii="宋体" w:hAnsi="宋体" w:hint="eastAsia"/>
           <w:b/>
           <w:color w:val="000000" w:themeColor="text1"/>
           <w:spacing w:val="1"/>
@@ -692,7 +705,7 @@
         <w:spacing w:line="360" w:lineRule="auto"/>
         <w:ind w:firstLineChars="381" w:firstLine="1071"/>
         <w:rPr>
-          <w:rFonts w:ascii="宋体" w:hAnsi="宋体"/>
+          <w:rFonts w:ascii="宋体" w:hAnsi="宋体" w:hint="eastAsia"/>
           <w:color w:val="000000" w:themeColor="text1"/>
           <w:kern w:val="0"/>
           <w:sz w:val="28"/>
@@ -862,7 +875,7 @@
         <w:spacing w:line="360" w:lineRule="auto"/>
         <w:ind w:firstLineChars="300" w:firstLine="1077"/>
         <w:rPr>
-          <w:rFonts w:ascii="宋体" w:hAnsi="宋体"/>
+          <w:rFonts w:ascii="宋体" w:hAnsi="宋体" w:hint="eastAsia"/>
           <w:color w:val="000000" w:themeColor="text1"/>
           <w:kern w:val="0"/>
           <w:sz w:val="28"/>
@@ -994,7 +1007,7 @@
         <w:spacing w:line="360" w:lineRule="auto"/>
         <w:ind w:firstLineChars="300" w:firstLine="1077"/>
         <w:rPr>
-          <w:rFonts w:ascii="宋体" w:hAnsi="宋体"/>
+          <w:rFonts w:ascii="宋体" w:hAnsi="宋体" w:hint="eastAsia"/>
           <w:color w:val="000000" w:themeColor="text1"/>
           <w:kern w:val="0"/>
           <w:sz w:val="28"/>
@@ -1053,7 +1066,7 @@
         <w:spacing w:line="360" w:lineRule="auto"/>
         <w:ind w:firstLineChars="231" w:firstLine="1079"/>
         <w:rPr>
-          <w:rFonts w:ascii="宋体" w:hAnsi="宋体"/>
+          <w:rFonts w:ascii="宋体" w:hAnsi="宋体" w:hint="eastAsia"/>
           <w:color w:val="000000" w:themeColor="text1"/>
           <w:kern w:val="0"/>
           <w:sz w:val="28"/>
@@ -1068,18 +1081,19 @@
           <w:kern w:val="0"/>
           <w:sz w:val="28"/>
         </w:rPr>
-        <w:t>导师姓</w:t>
-      </w:r>
+        <w:t>导师</w:t>
+      </w:r>
+      <w:proofErr w:type="gramStart"/>
       <w:r>
         <w:rPr>
           <w:rFonts w:ascii="宋体" w:hAnsi="宋体" w:hint="eastAsia"/>
           <w:b/>
           <w:color w:val="000000" w:themeColor="text1"/>
-          <w:spacing w:val="1"/>
+          <w:spacing w:val="93"/>
           <w:kern w:val="0"/>
           <w:sz w:val="28"/>
         </w:rPr>
-        <w:t xml:space="preserve">名 </w:t>
+        <w:t>姓</w:t>
       </w:r>
       <w:r>
         <w:rPr>
@@ -1089,6 +1103,17 @@
           <w:spacing w:val="1"/>
           <w:kern w:val="0"/>
           <w:sz w:val="28"/>
+        </w:rPr>
+        <w:t xml:space="preserve">名 </w:t>
+      </w:r>
+      <w:r>
+        <w:rPr>
+          <w:rFonts w:ascii="宋体" w:hAnsi="宋体" w:hint="eastAsia"/>
+          <w:b/>
+          <w:color w:val="000000" w:themeColor="text1"/>
+          <w:spacing w:val="1"/>
+          <w:kern w:val="0"/>
+          <w:sz w:val="28"/>
           <w:u w:val="single"/>
         </w:rPr>
         <w:t xml:space="preserve">           </w:t>
@@ -1129,7 +1154,6 @@
         </w:rPr>
         <w:t xml:space="preserve"> </w:t>
       </w:r>
-      <w:proofErr w:type="gramStart"/>
       <w:r>
         <w:rPr>
           <w:rFonts w:ascii="宋体" w:hAnsi="宋体" w:hint="eastAsia"/>
@@ -1216,7 +1240,7 @@
         <w:spacing w:line="360" w:lineRule="auto"/>
         <w:ind w:firstLineChars="231" w:firstLine="1079"/>
         <w:rPr>
-          <w:rFonts w:ascii="宋体" w:hAnsi="宋体"/>
+          <w:rFonts w:ascii="宋体" w:hAnsi="宋体" w:hint="eastAsia"/>
           <w:color w:val="000000" w:themeColor="text1"/>
           <w:sz w:val="28"/>
         </w:rPr>
@@ -1364,7 +1388,7 @@
         <w:spacing w:line="400" w:lineRule="exact"/>
         <w:ind w:firstLineChars="270" w:firstLine="756"/>
         <w:rPr>
-          <w:rFonts w:ascii="宋体" w:hAnsi="宋体"/>
+          <w:rFonts w:ascii="宋体" w:hAnsi="宋体" w:hint="eastAsia"/>
           <w:color w:val="000000" w:themeColor="text1"/>
           <w:kern w:val="0"/>
           <w:sz w:val="28"/>
@@ -1382,7 +1406,7 @@
         <w:spacing w:line="400" w:lineRule="exact"/>
         <w:ind w:firstLineChars="270" w:firstLine="756"/>
         <w:rPr>
-          <w:rFonts w:ascii="宋体" w:hAnsi="宋体"/>
+          <w:rFonts w:ascii="宋体" w:hAnsi="宋体" w:hint="eastAsia"/>
           <w:color w:val="000000" w:themeColor="text1"/>
           <w:kern w:val="0"/>
           <w:sz w:val="28"/>
@@ -1393,25 +1417,47 @@
       <w:pPr>
         <w:jc w:val="center"/>
         <w:rPr>
-          <w:rFonts w:ascii="宋体" w:hAnsi="宋体"/>
-          <w:color w:val="000000" w:themeColor="text1"/>
-          <w:kern w:val="0"/>
-          <w:sz w:val="24"/>
-        </w:rPr>
-      </w:pPr>
-      <w:r>
-        <w:rPr>
           <w:rFonts w:ascii="宋体" w:hAnsi="宋体" w:hint="eastAsia"/>
           <w:color w:val="000000" w:themeColor="text1"/>
           <w:kern w:val="0"/>
           <w:sz w:val="24"/>
         </w:rPr>
+      </w:pPr>
+      <w:r>
+        <w:rPr>
+          <w:rFonts w:ascii="宋体" w:hAnsi="宋体" w:hint="eastAsia"/>
+          <w:color w:val="000000" w:themeColor="text1"/>
+          <w:kern w:val="0"/>
+          <w:sz w:val="24"/>
+        </w:rPr>
         <w:t xml:space="preserve">   </w:t>
       </w:r>
     </w:p>
     <w:p>
       <w:pPr>
         <w:ind w:firstLineChars="595" w:firstLine="1911"/>
+        <w:rPr>
+          <w:rFonts w:ascii="宋体" w:hAnsi="宋体" w:hint="eastAsia"/>
+          <w:b/>
+          <w:color w:val="000000" w:themeColor="text1"/>
+          <w:kern w:val="0"/>
+          <w:sz w:val="32"/>
+          <w:szCs w:val="32"/>
+        </w:rPr>
+      </w:pPr>
+      <w:r>
+        <w:rPr>
+          <w:rFonts w:ascii="宋体" w:hAnsi="宋体" w:hint="eastAsia"/>
+          <w:b/>
+          <w:color w:val="000000" w:themeColor="text1"/>
+          <w:kern w:val="0"/>
+          <w:sz w:val="32"/>
+          <w:szCs w:val="32"/>
+        </w:rPr>
+        <w:t xml:space="preserve">填写日期：   </w:t>
+      </w:r>
+      <w:proofErr w:type="gramStart"/>
+      <w:r>
         <w:rPr>
           <w:rFonts w:ascii="宋体" w:hAnsi="宋体"/>
           <w:b/>
@@ -1420,7 +1466,8 @@
           <w:sz w:val="32"/>
           <w:szCs w:val="32"/>
         </w:rPr>
-      </w:pPr>
+        <w:t>202</w:t>
+      </w:r>
       <w:r>
         <w:rPr>
           <w:rFonts w:ascii="宋体" w:hAnsi="宋体" w:hint="eastAsia"/>
@@ -1430,9 +1477,31 @@
           <w:sz w:val="32"/>
           <w:szCs w:val="32"/>
         </w:rPr>
-        <w:t xml:space="preserve">填写日期：   </w:t>
-      </w:r>
-      <w:proofErr w:type="gramStart"/>
+        <w:t>5</w:t>
+      </w:r>
+      <w:r>
+        <w:rPr>
+          <w:rFonts w:ascii="宋体" w:hAnsi="宋体" w:hint="eastAsia"/>
+          <w:b/>
+          <w:color w:val="000000" w:themeColor="text1"/>
+          <w:kern w:val="0"/>
+          <w:sz w:val="32"/>
+          <w:szCs w:val="32"/>
+        </w:rPr>
+        <w:t xml:space="preserve">  年</w:t>
+      </w:r>
+      <w:proofErr w:type="gramEnd"/>
+      <w:r>
+        <w:rPr>
+          <w:rFonts w:ascii="宋体" w:hAnsi="宋体" w:hint="eastAsia"/>
+          <w:b/>
+          <w:color w:val="000000" w:themeColor="text1"/>
+          <w:kern w:val="0"/>
+          <w:sz w:val="32"/>
+          <w:szCs w:val="32"/>
+        </w:rPr>
+        <w:t xml:space="preserve"> </w:t>
+      </w:r>
       <w:r>
         <w:rPr>
           <w:rFonts w:ascii="宋体" w:hAnsi="宋体"/>
@@ -1442,7 +1511,7 @@
           <w:sz w:val="32"/>
           <w:szCs w:val="32"/>
         </w:rPr>
-        <w:t>202</w:t>
+        <w:t xml:space="preserve"> </w:t>
       </w:r>
       <w:r>
         <w:rPr>
@@ -1453,8 +1522,20 @@
           <w:sz w:val="32"/>
           <w:szCs w:val="32"/>
         </w:rPr>
-        <w:t>5</w:t>
-      </w:r>
+        <w:t>9</w:t>
+      </w:r>
+      <w:r>
+        <w:rPr>
+          <w:rFonts w:ascii="宋体" w:hAnsi="宋体"/>
+          <w:b/>
+          <w:color w:val="000000" w:themeColor="text1"/>
+          <w:kern w:val="0"/>
+          <w:sz w:val="32"/>
+          <w:szCs w:val="32"/>
+        </w:rPr>
+        <w:t xml:space="preserve"> </w:t>
+      </w:r>
+      <w:proofErr w:type="gramStart"/>
       <w:r>
         <w:rPr>
           <w:rFonts w:ascii="宋体" w:hAnsi="宋体" w:hint="eastAsia"/>
@@ -1464,9 +1545,19 @@
           <w:sz w:val="32"/>
           <w:szCs w:val="32"/>
         </w:rPr>
-        <w:t xml:space="preserve">  年</w:t>
-      </w:r>
-      <w:proofErr w:type="gramEnd"/>
+        <w:t xml:space="preserve">月 </w:t>
+      </w:r>
+      <w:r>
+        <w:rPr>
+          <w:rFonts w:ascii="宋体" w:hAnsi="宋体"/>
+          <w:b/>
+          <w:color w:val="000000" w:themeColor="text1"/>
+          <w:kern w:val="0"/>
+          <w:sz w:val="32"/>
+          <w:szCs w:val="32"/>
+        </w:rPr>
+        <w:t xml:space="preserve"> </w:t>
+      </w:r>
       <w:r>
         <w:rPr>
           <w:rFonts w:ascii="宋体" w:hAnsi="宋体" w:hint="eastAsia"/>
@@ -1476,92 +1567,25 @@
           <w:sz w:val="32"/>
           <w:szCs w:val="32"/>
         </w:rPr>
-        <w:t xml:space="preserve"> </w:t>
-      </w:r>
-      <w:r>
-        <w:rPr>
-          <w:rFonts w:ascii="宋体" w:hAnsi="宋体"/>
+        <w:t>20</w:t>
+      </w:r>
+      <w:proofErr w:type="gramEnd"/>
+      <w:r>
+        <w:rPr>
+          <w:rFonts w:ascii="宋体" w:hAnsi="宋体" w:hint="eastAsia"/>
           <w:b/>
           <w:color w:val="000000" w:themeColor="text1"/>
           <w:kern w:val="0"/>
           <w:sz w:val="32"/>
           <w:szCs w:val="32"/>
         </w:rPr>
-        <w:t xml:space="preserve"> </w:t>
-      </w:r>
-      <w:r>
+        <w:t xml:space="preserve"> 日   </w:t>
+      </w:r>
+    </w:p>
+    <w:p>
+      <w:pPr>
         <w:rPr>
           <w:rFonts w:ascii="宋体" w:hAnsi="宋体" w:hint="eastAsia"/>
-          <w:b/>
-          <w:color w:val="000000" w:themeColor="text1"/>
-          <w:kern w:val="0"/>
-          <w:sz w:val="32"/>
-          <w:szCs w:val="32"/>
-        </w:rPr>
-        <w:t>9</w:t>
-      </w:r>
-      <w:r>
-        <w:rPr>
-          <w:rFonts w:ascii="宋体" w:hAnsi="宋体"/>
-          <w:b/>
-          <w:color w:val="000000" w:themeColor="text1"/>
-          <w:kern w:val="0"/>
-          <w:sz w:val="32"/>
-          <w:szCs w:val="32"/>
-        </w:rPr>
-        <w:t xml:space="preserve"> </w:t>
-      </w:r>
-      <w:proofErr w:type="gramStart"/>
-      <w:r>
-        <w:rPr>
-          <w:rFonts w:ascii="宋体" w:hAnsi="宋体" w:hint="eastAsia"/>
-          <w:b/>
-          <w:color w:val="000000" w:themeColor="text1"/>
-          <w:kern w:val="0"/>
-          <w:sz w:val="32"/>
-          <w:szCs w:val="32"/>
-        </w:rPr>
-        <w:t xml:space="preserve">月 </w:t>
-      </w:r>
-      <w:r>
-        <w:rPr>
-          <w:rFonts w:ascii="宋体" w:hAnsi="宋体"/>
-          <w:b/>
-          <w:color w:val="000000" w:themeColor="text1"/>
-          <w:kern w:val="0"/>
-          <w:sz w:val="32"/>
-          <w:szCs w:val="32"/>
-        </w:rPr>
-        <w:t xml:space="preserve"> </w:t>
-      </w:r>
-      <w:r>
-        <w:rPr>
-          <w:rFonts w:ascii="宋体" w:hAnsi="宋体" w:hint="eastAsia"/>
-          <w:b/>
-          <w:color w:val="000000" w:themeColor="text1"/>
-          <w:kern w:val="0"/>
-          <w:sz w:val="32"/>
-          <w:szCs w:val="32"/>
-        </w:rPr>
-        <w:t>20</w:t>
-      </w:r>
-      <w:proofErr w:type="gramEnd"/>
-      <w:r>
-        <w:rPr>
-          <w:rFonts w:ascii="宋体" w:hAnsi="宋体" w:hint="eastAsia"/>
-          <w:b/>
-          <w:color w:val="000000" w:themeColor="text1"/>
-          <w:kern w:val="0"/>
-          <w:sz w:val="32"/>
-          <w:szCs w:val="32"/>
-        </w:rPr>
-        <w:t xml:space="preserve"> 日   </w:t>
-      </w:r>
-    </w:p>
-    <w:p>
-      <w:pPr>
-        <w:rPr>
-          <w:rFonts w:ascii="宋体" w:hAnsi="宋体"/>
           <w:color w:val="000000" w:themeColor="text1"/>
           <w:kern w:val="0"/>
           <w:sz w:val="28"/>
@@ -1583,7 +1607,7 @@
         <w:spacing w:line="400" w:lineRule="exact"/>
         <w:jc w:val="center"/>
         <w:rPr>
-          <w:rFonts w:ascii="黑体" w:eastAsia="黑体" w:hAnsi="黑体"/>
+          <w:rFonts w:ascii="黑体" w:eastAsia="黑体" w:hAnsi="黑体" w:hint="eastAsia"/>
           <w:color w:val="000000" w:themeColor="text1"/>
           <w:sz w:val="36"/>
           <w:szCs w:val="32"/>
@@ -1605,7 +1629,7 @@
         <w:spacing w:line="400" w:lineRule="exact"/>
         <w:jc w:val="center"/>
         <w:rPr>
-          <w:rFonts w:ascii="黑体" w:eastAsia="黑体" w:hAnsi="黑体"/>
+          <w:rFonts w:ascii="黑体" w:eastAsia="黑体" w:hAnsi="黑体" w:hint="eastAsia"/>
           <w:color w:val="000000" w:themeColor="text1"/>
           <w:sz w:val="36"/>
           <w:szCs w:val="32"/>
@@ -1614,84 +1638,75 @@
     </w:p>
     <w:p>
       <w:pPr>
-        <w:spacing w:line="400" w:lineRule="exact"/>
-        <w:ind w:firstLineChars="175" w:firstLine="420"/>
+        <w:spacing w:line="360" w:lineRule="auto"/>
+        <w:ind w:firstLineChars="200" w:firstLine="480"/>
         <w:jc w:val="both"/>
         <w:rPr>
+          <w:rFonts w:ascii="黑体" w:eastAsia="黑体" w:hAnsi="黑体" w:hint="eastAsia"/>
+          <w:color w:val="000000" w:themeColor="text1"/>
+          <w:sz w:val="24"/>
+        </w:rPr>
+      </w:pPr>
+      <w:r>
+        <w:rPr>
+          <w:rFonts w:ascii="宋体" w:hAnsi="宋体"/>
+          <w:color w:val="000000" w:themeColor="text1"/>
+          <w:sz w:val="24"/>
+        </w:rPr>
+        <w:t>道路病害检测对于保障交通安全与实现基础设施的智能化维护至关重要。本文首先论述了传统人工巡检方式的局限性，进而系统综述了自动化检测技术的发展脉络。内容涵盖了从基于边缘检测、阈值分割等传统图像处理方法，到以卷积神经网络（CNN）为核心的深度学习方法的范式革命。在深度学习技术路线中，本文重点对比分析了以Faster R-CNN为代表的两阶段检测算法和以YOLO系列为代表的单阶段检测算法，并阐明了后者在实时检测任务中的主流地位。针对当前最先进模型（如YOLOv12）在部署于车载等边缘计算设备时面临的计算资源瓶颈，本文进一步探讨了两大关键优化技术：一是以</w:t>
+      </w:r>
+      <w:proofErr w:type="spellStart"/>
+      <w:r>
+        <w:rPr>
+          <w:rFonts w:ascii="宋体" w:hAnsi="宋体"/>
+          <w:color w:val="000000" w:themeColor="text1"/>
+          <w:sz w:val="24"/>
+        </w:rPr>
+        <w:t>GhostNet</w:t>
+      </w:r>
+      <w:proofErr w:type="spellEnd"/>
+      <w:r>
+        <w:rPr>
+          <w:rFonts w:ascii="宋体" w:hAnsi="宋体"/>
+          <w:color w:val="000000" w:themeColor="text1"/>
+          <w:sz w:val="24"/>
+        </w:rPr>
+        <w:t>为代表的模型轻量化设计，旨在降低模型参数量与计算复杂度；二是以无参数注意力机制SimAM为代表的特征增强策略，用于弥补轻量化可能带来的精度损失并提升对小目标的识别能力。最后，本综述指出现有研究在模型轻量化与特定任务精度优化之间的平衡仍有提升空间，从而引出本课题的研究动机：通过对YOLOv12模型进行轻量化改造并融合高效注意力机制，研发一种在精度、速度和模型大小上达到更优平衡的道路病害实时检测新方法，以满足真实场景的部署需求。</w:t>
+      </w:r>
+      <w:r>
+        <w:rPr>
           <w:rFonts w:ascii="黑体" w:eastAsia="黑体" w:hAnsi="黑体"/>
           <w:color w:val="000000" w:themeColor="text1"/>
           <w:sz w:val="24"/>
         </w:rPr>
-      </w:pPr>
+        <w:tab/>
+      </w:r>
+    </w:p>
+    <w:p>
+      <w:pPr>
+        <w:spacing w:beforeLines="100" w:before="436" w:line="360" w:lineRule="auto"/>
+        <w:jc w:val="both"/>
+        <w:rPr>
+          <w:rFonts w:ascii="宋体" w:hAnsi="宋体" w:hint="eastAsia"/>
+          <w:color w:val="000000" w:themeColor="text1"/>
+          <w:sz w:val="24"/>
+        </w:rPr>
+      </w:pPr>
+      <w:r>
+        <w:rPr>
+          <w:rFonts w:ascii="黑体" w:eastAsia="黑体" w:hAnsi="黑体" w:hint="eastAsia"/>
+          <w:color w:val="000000" w:themeColor="text1"/>
+          <w:sz w:val="24"/>
+        </w:rPr>
+        <w:t>关键词：</w:t>
+      </w:r>
       <w:r>
         <w:rPr>
           <w:rFonts w:ascii="宋体" w:hAnsi="宋体"/>
           <w:color w:val="000000" w:themeColor="text1"/>
           <w:sz w:val="24"/>
         </w:rPr>
-        <w:t>道路病害检测对于保障交通安全与实现基础设施的智能化维护至关重要。本文首先论述了传统人工巡检方式的局限性，进而系统综述了自动化检测技术的发展脉络。内容涵盖了从基于边缘检测、阈值分割等传统图像处理方法，到以卷积神经网络（CNN）为核心的深度学习方法的范式革命。在深度学习技术路线中，本文重点对比分析了以Faster R-CNN为代表的两阶段检测算法和以YOLO系列为代表的</w:t>
-      </w:r>
-      <w:proofErr w:type="gramStart"/>
-      <w:r>
-        <w:rPr>
-          <w:rFonts w:ascii="宋体" w:hAnsi="宋体"/>
-          <w:color w:val="000000" w:themeColor="text1"/>
-          <w:sz w:val="24"/>
-        </w:rPr>
-        <w:t>单阶段</w:t>
-      </w:r>
-      <w:proofErr w:type="gramEnd"/>
-      <w:r>
-        <w:rPr>
-          <w:rFonts w:ascii="宋体" w:hAnsi="宋体"/>
-          <w:color w:val="000000" w:themeColor="text1"/>
-          <w:sz w:val="24"/>
-        </w:rPr>
-        <w:t>检测算法，并阐明了后者在实时检测任务中的主流地位。针对当前最先进模型（如YOLOv12）在部署于</w:t>
-      </w:r>
-      <w:proofErr w:type="gramStart"/>
-      <w:r>
-        <w:rPr>
-          <w:rFonts w:ascii="宋体" w:hAnsi="宋体"/>
-          <w:color w:val="000000" w:themeColor="text1"/>
-          <w:sz w:val="24"/>
-        </w:rPr>
-        <w:t>车载等</w:t>
-      </w:r>
-      <w:proofErr w:type="gramEnd"/>
-      <w:r>
-        <w:rPr>
-          <w:rFonts w:ascii="宋体" w:hAnsi="宋体"/>
-          <w:color w:val="000000" w:themeColor="text1"/>
-          <w:sz w:val="24"/>
-        </w:rPr>
-        <w:t>边缘计算设备时面临的计算资源瓶颈，本文进一步探讨了两大关键优化技术：一是以</w:t>
-      </w:r>
-      <w:proofErr w:type="spellStart"/>
-      <w:r>
-        <w:rPr>
-          <w:rFonts w:ascii="宋体" w:hAnsi="宋体"/>
-          <w:color w:val="000000" w:themeColor="text1"/>
-          <w:sz w:val="24"/>
-        </w:rPr>
-        <w:t>GhostNet</w:t>
-      </w:r>
-      <w:proofErr w:type="spellEnd"/>
-      <w:r>
-        <w:rPr>
-          <w:rFonts w:ascii="宋体" w:hAnsi="宋体"/>
-          <w:color w:val="000000" w:themeColor="text1"/>
-          <w:sz w:val="24"/>
-        </w:rPr>
-        <w:t>为代表的模型轻量化设计，旨在降低模型参数量与计算复杂度；二是以无参数注意力机制SimAM为代表的特征增强策略，用于弥补轻量化可能带来的精度损失并提升对小目标的识别能力。最后，本综述指出现有研究在模型轻量化与特定任务精度优化之间的平衡仍有提升空间，从而引出本课题的研究动机：通过对YOLOv12模型进行轻量化改造并融合高效注意力机制，研发一种在精度、速度和模型大小上达到更优平衡的道路病害实时检测新方法，以满足真实场景的部署需求。</w:t>
-      </w:r>
-      <w:r>
-        <w:rPr>
-          <w:rFonts w:ascii="黑体" w:eastAsia="黑体" w:hAnsi="黑体"/>
-          <w:color w:val="000000" w:themeColor="text1"/>
-          <w:sz w:val="24"/>
-        </w:rPr>
-        <w:tab/>
+        <w:t>道路病害检测；深度学习；目标检测；YOLO；模型轻量化；注意力机制</w:t>
       </w:r>
     </w:p>
     <w:p>
@@ -1699,78 +1714,7 @@
         <w:spacing w:line="400" w:lineRule="exact"/>
         <w:jc w:val="both"/>
         <w:rPr>
-          <w:rFonts w:ascii="宋体" w:hAnsi="宋体"/>
-          <w:color w:val="000000" w:themeColor="text1"/>
-          <w:sz w:val="24"/>
-        </w:rPr>
-      </w:pPr>
-      <w:r>
-        <w:rPr>
           <w:rFonts w:ascii="黑体" w:eastAsia="黑体" w:hAnsi="黑体" w:hint="eastAsia"/>
-          <w:color w:val="000000" w:themeColor="text1"/>
-          <w:sz w:val="24"/>
-        </w:rPr>
-        <w:t>关键词：</w:t>
-      </w:r>
-      <w:r>
-        <w:rPr>
-          <w:rFonts w:ascii="宋体" w:hAnsi="宋体"/>
-          <w:color w:val="000000" w:themeColor="text1"/>
-          <w:sz w:val="24"/>
-        </w:rPr>
-        <w:t>道路病害检测；深度学习；目标检测；YOLO；模型轻量化；注意力机制</w:t>
-      </w:r>
-    </w:p>
-    <w:p>
-      <w:pPr>
-        <w:spacing w:line="400" w:lineRule="exact"/>
-        <w:jc w:val="both"/>
-        <w:rPr>
-          <w:rFonts w:ascii="黑体" w:eastAsia="黑体" w:hAnsi="黑体"/>
-          <w:color w:val="000000" w:themeColor="text1"/>
-          <w:sz w:val="24"/>
-        </w:rPr>
-      </w:pPr>
-    </w:p>
-    <w:p>
-      <w:pPr>
-        <w:spacing w:line="400" w:lineRule="exact"/>
-        <w:jc w:val="both"/>
-        <w:rPr>
-          <w:rFonts w:ascii="黑体" w:eastAsia="黑体" w:hAnsi="黑体"/>
-          <w:color w:val="000000" w:themeColor="text1"/>
-          <w:sz w:val="24"/>
-        </w:rPr>
-      </w:pPr>
-    </w:p>
-    <w:p>
-      <w:pPr>
-        <w:spacing w:line="400" w:lineRule="exact"/>
-        <w:jc w:val="both"/>
-        <w:rPr>
-          <w:rFonts w:ascii="黑体" w:eastAsia="黑体" w:hAnsi="黑体"/>
-          <w:color w:val="000000" w:themeColor="text1"/>
-          <w:sz w:val="24"/>
-        </w:rPr>
-      </w:pPr>
-    </w:p>
-    <w:p>
-      <w:pPr>
-        <w:spacing w:line="400" w:lineRule="exact"/>
-        <w:jc w:val="both"/>
-        <w:rPr>
-          <w:rFonts w:ascii="黑体" w:eastAsia="黑体" w:hAnsi="黑体"/>
-          <w:color w:val="000000" w:themeColor="text1"/>
-          <w:sz w:val="24"/>
-        </w:rPr>
-      </w:pPr>
-    </w:p>
-    <w:p>
-      <w:pPr>
-        <w:spacing w:line="400" w:lineRule="exact"/>
-        <w:jc w:val="both"/>
-        <w:rPr>
-          <w:rFonts w:ascii="黑体" w:eastAsia="黑体" w:hAnsi="黑体"/>
           <w:color w:val="000000" w:themeColor="text1"/>
           <w:sz w:val="24"/>
         </w:rPr>
@@ -1787,7 +1731,7 @@
         <w:spacing w:line="400" w:lineRule="exact"/>
         <w:jc w:val="both"/>
         <w:rPr>
-          <w:rFonts w:ascii="黑体" w:eastAsia="黑体" w:hAnsi="黑体"/>
+          <w:rFonts w:ascii="黑体" w:eastAsia="黑体" w:hAnsi="黑体" w:hint="eastAsia"/>
           <w:color w:val="000000" w:themeColor="text1"/>
           <w:sz w:val="24"/>
         </w:rPr>
@@ -1832,7 +1776,7 @@
     </w:p>
     <w:p>
       <w:pPr>
-        <w:spacing w:line="480" w:lineRule="exact"/>
+        <w:spacing w:line="360" w:lineRule="auto"/>
         <w:ind w:firstLine="420"/>
         <w:jc w:val="both"/>
         <w:rPr>
@@ -1867,6 +1811,34 @@
         </w:rPr>
         <w:t xml:space="preserve">, which aims to reduce model parameters and computational complexity. The second is feature enhancement strategies, such as the parameter-free attention mechanism SimAM, used to compensate for potential accuracy degradation from lightweighting and improve the detection of small targets. Finally, this review identifies a research gap in balancing model efficiency with task-specific accuracy. This motivates the current research project: </w:t>
       </w:r>
+      <w:r>
+        <w:rPr>
+          <w:rFonts w:eastAsia="黑体"/>
+          <w:color w:val="000000" w:themeColor="text1"/>
+          <w:sz w:val="24"/>
+        </w:rPr>
+        <w:t xml:space="preserve">to develop a novel real-time pavement distress detection method by redesigning YOLOv12 with lightweight modules and integrating an efficient attention </w:t>
+      </w:r>
+      <w:r>
+        <w:rPr>
+          <w:rFonts w:eastAsia="黑体"/>
+          <w:color w:val="000000" w:themeColor="text1"/>
+          <w:sz w:val="24"/>
+        </w:rPr>
+        <w:lastRenderedPageBreak/>
+        <w:t>mechanism, aiming to achieve a superior trade-off among accuracy, speed, and model size for practical deployment in real-world scenarios.</w:t>
+      </w:r>
+    </w:p>
+    <w:p>
+      <w:pPr>
+        <w:spacing w:beforeLines="100" w:before="436" w:line="360" w:lineRule="auto"/>
+        <w:jc w:val="both"/>
+        <w:rPr>
+          <w:rFonts w:eastAsia="黑体"/>
+          <w:color w:val="000000" w:themeColor="text1"/>
+          <w:sz w:val="24"/>
+        </w:rPr>
+      </w:pPr>
       <w:r>
         <w:rPr>
           <w:rFonts w:eastAsia="黑体"/>
@@ -1875,19 +1847,18 @@
           <w:color w:val="000000" w:themeColor="text1"/>
           <w:sz w:val="24"/>
         </w:rPr>
-        <w:t>to develop a novel real-time pavement distress detection method by redesigning YOLOv12 with lightweight modules and integrating an efficient attention mechanism, aiming to achieve a superior trade-off among accuracy, speed, and model size for practical deployment in real-world scenarios.</w:t>
-      </w:r>
-    </w:p>
-    <w:p>
-      <w:pPr>
-        <w:spacing w:line="480" w:lineRule="exact"/>
-        <w:jc w:val="both"/>
-        <w:rPr>
-          <w:rFonts w:eastAsia="黑体"/>
-          <w:color w:val="000000" w:themeColor="text1"/>
-          <w:sz w:val="24"/>
-        </w:rPr>
-      </w:pPr>
+        <w:t>Key words</w:t>
+      </w:r>
+      <w:r>
+        <w:rPr>
+          <w:rFonts w:eastAsia="黑体" w:hint="eastAsia"/>
+          <w:b/>
+          <w:bCs/>
+          <w:color w:val="000000" w:themeColor="text1"/>
+          <w:sz w:val="24"/>
+        </w:rPr>
+        <w:t>:</w:t>
+      </w:r>
       <w:r>
         <w:rPr>
           <w:rFonts w:eastAsia="黑体"/>
@@ -1896,31 +1867,11 @@
           <w:color w:val="000000" w:themeColor="text1"/>
           <w:sz w:val="24"/>
         </w:rPr>
-        <w:t>Key words</w:t>
-      </w:r>
-      <w:r>
-        <w:rPr>
-          <w:rFonts w:eastAsia="黑体" w:hint="eastAsia"/>
-          <w:b/>
-          <w:bCs/>
-          <w:color w:val="000000" w:themeColor="text1"/>
-          <w:sz w:val="24"/>
-        </w:rPr>
-        <w:t>:</w:t>
+        <w:t xml:space="preserve"> </w:t>
       </w:r>
       <w:r>
         <w:rPr>
           <w:rFonts w:eastAsia="黑体"/>
-          <w:b/>
-          <w:bCs/>
-          <w:color w:val="000000" w:themeColor="text1"/>
-          <w:sz w:val="24"/>
-        </w:rPr>
-        <w:t xml:space="preserve"> </w:t>
-      </w:r>
-      <w:r>
-        <w:rPr>
-          <w:rFonts w:eastAsia="黑体"/>
           <w:color w:val="000000" w:themeColor="text1"/>
           <w:sz w:val="24"/>
         </w:rPr>
@@ -1931,51 +1882,7 @@
       <w:pPr>
         <w:spacing w:line="480" w:lineRule="exact"/>
         <w:rPr>
-          <w:rFonts w:ascii="黑体" w:eastAsia="黑体" w:hAnsi="黑体"/>
-          <w:color w:val="000000" w:themeColor="text1"/>
-          <w:sz w:val="36"/>
-          <w:szCs w:val="32"/>
-        </w:rPr>
-      </w:pPr>
-    </w:p>
-    <w:p>
-      <w:pPr>
-        <w:spacing w:line="480" w:lineRule="exact"/>
-        <w:rPr>
-          <w:rFonts w:ascii="黑体" w:eastAsia="黑体" w:hAnsi="黑体"/>
-          <w:color w:val="000000" w:themeColor="text1"/>
-          <w:sz w:val="36"/>
-          <w:szCs w:val="32"/>
-        </w:rPr>
-      </w:pPr>
-    </w:p>
-    <w:p>
-      <w:pPr>
-        <w:spacing w:line="480" w:lineRule="exact"/>
-        <w:rPr>
-          <w:rFonts w:ascii="黑体" w:eastAsia="黑体" w:hAnsi="黑体"/>
-          <w:color w:val="000000" w:themeColor="text1"/>
-          <w:sz w:val="36"/>
-          <w:szCs w:val="32"/>
-        </w:rPr>
-      </w:pPr>
-    </w:p>
-    <w:p>
-      <w:pPr>
-        <w:spacing w:line="480" w:lineRule="exact"/>
-        <w:rPr>
-          <w:rFonts w:ascii="黑体" w:eastAsia="黑体" w:hAnsi="黑体"/>
-          <w:color w:val="000000" w:themeColor="text1"/>
-          <w:sz w:val="36"/>
-          <w:szCs w:val="32"/>
-        </w:rPr>
-      </w:pPr>
-    </w:p>
-    <w:p>
-      <w:pPr>
-        <w:spacing w:line="480" w:lineRule="exact"/>
-        <w:rPr>
-          <w:rFonts w:ascii="黑体" w:eastAsia="黑体" w:hAnsi="黑体"/>
+          <w:rFonts w:ascii="黑体" w:eastAsia="黑体" w:hAnsi="黑体" w:hint="eastAsia"/>
           <w:color w:val="000000" w:themeColor="text1"/>
           <w:sz w:val="36"/>
           <w:szCs w:val="32"/>
@@ -1996,6 +1903,7 @@
           <w:rFonts w:ascii="Times New Roman" w:hAnsi="Times New Roman"/>
         </w:rPr>
       </w:pPr>
+      <w:proofErr w:type="gramStart"/>
       <w:r>
         <w:rPr>
           <w:rFonts w:ascii="Times New Roman" w:eastAsia="黑体" w:hAnsi="Times New Roman"/>
@@ -2003,6 +1911,7 @@
           <w:bCs w:val="0"/>
           <w:color w:val="000000" w:themeColor="text1"/>
         </w:rPr>
+        <w:lastRenderedPageBreak/>
         <w:t xml:space="preserve">1 </w:t>
       </w:r>
       <w:r>
@@ -2014,11 +1923,12 @@
         </w:rPr>
         <w:t>引言</w:t>
       </w:r>
+      <w:proofErr w:type="gramEnd"/>
     </w:p>
     <w:p>
       <w:pPr>
         <w:pStyle w:val="ac"/>
-        <w:spacing w:beforeLines="50" w:before="218" w:beforeAutospacing="0" w:afterLines="50" w:after="218" w:afterAutospacing="0"/>
+        <w:spacing w:beforeLines="50" w:before="218" w:beforeAutospacing="0" w:afterLines="50" w:after="218" w:afterAutospacing="0" w:line="360" w:lineRule="auto"/>
         <w:ind w:firstLineChars="200" w:firstLine="480"/>
         <w:jc w:val="both"/>
         <w:rPr>
@@ -2037,21 +1947,7 @@
         <w:rPr>
           <w:rFonts w:hint="eastAsia"/>
         </w:rPr>
-        <w:t>着全球城市化进程的不断加速和机动车保有量的持续攀升，现代社会对交通运输系统的依赖达到了前所未有的高度。在这一背景下，道路作为</w:t>
-      </w:r>
-      <w:proofErr w:type="gramStart"/>
-      <w:r>
-        <w:rPr>
-          <w:rFonts w:hint="eastAsia"/>
-        </w:rPr>
-        <w:t>最</w:t>
-      </w:r>
-      <w:proofErr w:type="gramEnd"/>
-      <w:r>
-        <w:rPr>
-          <w:rFonts w:hint="eastAsia"/>
-        </w:rPr>
-        <w:t>基础的交通基础设施，其健康状况直接关系到交通安全、通行效率乃至区域经济发展。然而，道路结构在其生命周期中，长期承受车辆荷载与自然环境的综合作用，不可避免地会产生裂缝、坑洞等多种形式的病害</w:t>
+        <w:t>着全球城市化进程的不断加速和机动车保有量的持续攀升，现代社会对交通运输系统的依赖达到了前所未有的高度。在这一背景下，道路作为最基础的交通基础设施，其健康状况直接关系到交通安全、通行效率乃至区域经济发展。然而，道路结构在其生命周期中，长期承受车辆荷载与自然环境的综合作用，不可避免地会产生裂缝、坑洞等多种形式的病害</w:t>
       </w:r>
       <w:r>
         <w:rPr>
@@ -2063,21 +1959,7 @@
         <w:rPr>
           <w:rFonts w:hint="eastAsia"/>
         </w:rPr>
-        <w:t>这些病害若未能得到及时发现与修复，不仅严重影响行车体验，更对行车安全构成直接威胁。研究表明，恶劣的路面状况甚至会导致燃油消耗和</w:t>
-      </w:r>
-      <w:proofErr w:type="gramStart"/>
-      <w:r>
-        <w:rPr>
-          <w:rFonts w:hint="eastAsia"/>
-        </w:rPr>
-        <w:t>碳排放</w:t>
-      </w:r>
-      <w:proofErr w:type="gramEnd"/>
-      <w:r>
-        <w:rPr>
-          <w:rFonts w:hint="eastAsia"/>
-        </w:rPr>
-        <w:t>的增加，对环境造成负面影响</w:t>
+        <w:t>这些病害若未能得到及时发现与修复，不仅严重影响行车体验，更对行车安全构成直接威胁。研究表明，恶劣的路面状况甚至会导致燃油消耗和碳排放的增加，对环境造成负面影响</w:t>
       </w:r>
       <w:r>
         <w:rPr>
@@ -2088,7 +1970,7 @@
     </w:p>
     <w:p>
       <w:pPr>
-        <w:spacing w:beforeLines="50" w:before="218" w:afterLines="50" w:after="218"/>
+        <w:spacing w:beforeLines="50" w:before="218" w:afterLines="50" w:after="218" w:line="360" w:lineRule="auto"/>
         <w:ind w:firstLineChars="200" w:firstLine="480"/>
         <w:jc w:val="both"/>
         <w:rPr>
@@ -2212,7 +2094,7 @@
     </w:p>
     <w:p>
       <w:pPr>
-        <w:spacing w:beforeLines="50" w:before="218" w:afterLines="50" w:after="218"/>
+        <w:spacing w:beforeLines="50" w:before="218" w:afterLines="50" w:after="218" w:line="360" w:lineRule="auto"/>
         <w:ind w:firstLineChars="200" w:firstLine="480"/>
         <w:jc w:val="both"/>
         <w:rPr>
@@ -2243,7 +2125,16 @@
           <w:kern w:val="0"/>
           <w:sz w:val="24"/>
         </w:rPr>
-        <w:t>让计算机模仿人类视觉系统，自动识别并定位图像中的关键目标（即道路病害），不仅能极大提升巡检效率、降低成本，更能实现从主观、稀疏的数据采集向客观、密集的数据驱动决策的转变。这种转变是实现智能交通系统和自动化基础设施管理的关键一步，能够为道路养护部门提供前所未有的数据洞察力，从而优化资源分配，实施预防性维护，最终提升整个交通网络的安全性和耐久性</w:t>
+        <w:t>让计算机模仿人类视觉系统，自动识别并定位图像中的关键目标（即道路病害），不仅能极大提升巡检效率、降低成本，更能实现从主观、稀疏的数据采集向客观、密集的数据驱动决策的转变。这种转变是实现智能交通系统和自动化基础设施管理的关键一步，能够为道路养护部门提供前所未有的数据洞察力，从而</w:t>
+      </w:r>
+      <w:r>
+        <w:rPr>
+          <w:rFonts w:ascii="宋体" w:hAnsi="宋体" w:cs="宋体" w:hint="eastAsia"/>
+          <w:kern w:val="0"/>
+          <w:sz w:val="24"/>
+        </w:rPr>
+        <w:lastRenderedPageBreak/>
+        <w:t>优化资源分配，实施预防性维护，最终提升整个交通网络的安全性和耐久性</w:t>
       </w:r>
       <w:r>
         <w:rPr>
@@ -2318,7 +2209,7 @@
     <w:p>
       <w:pPr>
         <w:pStyle w:val="aa"/>
-        <w:spacing w:beforeLines="50" w:before="218" w:afterLines="50" w:after="218" w:line="240" w:lineRule="auto"/>
+        <w:spacing w:beforeLines="50" w:before="218" w:afterLines="50" w:after="218" w:line="360" w:lineRule="auto"/>
         <w:ind w:firstLineChars="200" w:firstLine="480"/>
         <w:jc w:val="both"/>
         <w:outlineLvl w:val="9"/>
@@ -2414,7 +2305,7 @@
     <w:p>
       <w:pPr>
         <w:pStyle w:val="ac"/>
-        <w:spacing w:beforeLines="50" w:before="218" w:beforeAutospacing="0" w:afterLines="50" w:after="218" w:afterAutospacing="0"/>
+        <w:spacing w:beforeLines="50" w:before="218" w:beforeAutospacing="0" w:afterLines="50" w:after="218" w:afterAutospacing="0" w:line="360" w:lineRule="auto"/>
         <w:ind w:firstLineChars="200" w:firstLine="480"/>
         <w:jc w:val="both"/>
         <w:rPr>
@@ -2441,7 +2332,7 @@
     </w:p>
     <w:p>
       <w:pPr>
-        <w:spacing w:beforeLines="50" w:before="218" w:afterLines="50" w:after="218"/>
+        <w:spacing w:beforeLines="50" w:before="218" w:afterLines="50" w:after="218" w:line="360" w:lineRule="auto"/>
         <w:ind w:firstLineChars="200" w:firstLine="480"/>
         <w:jc w:val="both"/>
         <w:rPr>
@@ -2723,7 +2614,16 @@
           <w:kern w:val="0"/>
           <w:sz w:val="24"/>
         </w:rPr>
-        <w:t>是一种经典的自适应阈值选择方法，它通过最大化类间方差来自动确定最佳分割阈值，常被用于尝试将坑洞等颜色异常区域从背景中分离出来</w:t>
+        <w:t>是一种经典的自适应阈值选择方法，它通过最大化类间方差来自动确定最佳分割阈值，常被用于尝试将坑</w:t>
+      </w:r>
+      <w:r>
+        <w:rPr>
+          <w:rFonts w:ascii="宋体" w:hAnsi="宋体" w:cs="宋体" w:hint="eastAsia"/>
+          <w:kern w:val="0"/>
+          <w:sz w:val="24"/>
+        </w:rPr>
+        <w:lastRenderedPageBreak/>
+        <w:t>洞等颜色异常区域从背景中分离出来</w:t>
       </w:r>
       <w:r>
         <w:rPr>
@@ -2827,7 +2727,7 @@
     </w:p>
     <w:p>
       <w:pPr>
-        <w:spacing w:beforeLines="50" w:before="218" w:afterLines="50" w:after="218"/>
+        <w:spacing w:beforeLines="50" w:before="218" w:afterLines="50" w:after="218" w:line="360" w:lineRule="auto"/>
         <w:ind w:firstLineChars="200" w:firstLine="480"/>
         <w:jc w:val="both"/>
         <w:rPr>
@@ -2903,7 +2803,7 @@
     </w:p>
     <w:p>
       <w:pPr>
-        <w:spacing w:beforeLines="50" w:before="218" w:afterLines="50" w:after="218" w:line="400" w:lineRule="exact"/>
+        <w:spacing w:beforeLines="50" w:before="218" w:afterLines="50" w:after="218" w:line="360" w:lineRule="auto"/>
         <w:jc w:val="both"/>
         <w:rPr>
           <w:rFonts w:eastAsia="黑体"/>
@@ -2942,6 +2842,7 @@
     </w:p>
     <w:p>
       <w:pPr>
+        <w:spacing w:line="360" w:lineRule="auto"/>
         <w:ind w:firstLine="420"/>
         <w:jc w:val="both"/>
         <w:rPr>
@@ -3161,38 +3062,20 @@
           <w:sz w:val="24"/>
           <w:lang w:bidi="ar"/>
         </w:rPr>
-        <w:t>目前，该领域的方法主要可以分为两阶段检测算法和</w:t>
-      </w:r>
-      <w:proofErr w:type="gramStart"/>
+        <w:t>目前，该领域的方法主要可以分为两阶段检测算法和单阶段检测算法两大技术路线</w:t>
+      </w:r>
       <w:r>
         <w:rPr>
           <w:kern w:val="44"/>
           <w:sz w:val="24"/>
           <w:lang w:bidi="ar"/>
         </w:rPr>
-        <w:t>单阶段</w:t>
-      </w:r>
-      <w:proofErr w:type="gramEnd"/>
-      <w:r>
-        <w:rPr>
-          <w:kern w:val="44"/>
-          <w:sz w:val="24"/>
-          <w:lang w:bidi="ar"/>
-        </w:rPr>
-        <w:t>检测算法两大技术路线</w:t>
-      </w:r>
-      <w:r>
-        <w:rPr>
-          <w:kern w:val="44"/>
-          <w:sz w:val="24"/>
-          <w:lang w:bidi="ar"/>
-        </w:rPr>
         <w:t>。</w:t>
       </w:r>
     </w:p>
     <w:p>
       <w:pPr>
-        <w:spacing w:beforeLines="50" w:before="218" w:afterLines="50" w:after="218" w:line="400" w:lineRule="exact"/>
+        <w:spacing w:beforeLines="50" w:before="218" w:afterLines="50" w:after="218" w:line="360" w:lineRule="auto"/>
         <w:jc w:val="both"/>
         <w:rPr>
           <w:rFonts w:eastAsia="黑体"/>
@@ -3228,7 +3111,7 @@
     <w:p>
       <w:pPr>
         <w:pStyle w:val="ac"/>
-        <w:spacing w:beforeLines="50" w:before="218" w:beforeAutospacing="0" w:afterLines="50" w:after="218" w:afterAutospacing="0"/>
+        <w:spacing w:beforeLines="50" w:before="218" w:beforeAutospacing="0" w:afterLines="50" w:after="218" w:afterAutospacing="0" w:line="360" w:lineRule="auto"/>
         <w:ind w:firstLineChars="200" w:firstLine="480"/>
         <w:jc w:val="both"/>
         <w:rPr>
@@ -3239,6 +3122,7 @@
         <w:rPr>
           <w:rFonts w:hint="eastAsia"/>
         </w:rPr>
+        <w:lastRenderedPageBreak/>
         <w:t>两阶段检测算法以</w:t>
       </w:r>
       <w:r>
@@ -3295,7 +3179,7 @@
     </w:p>
     <w:p>
       <w:pPr>
-        <w:spacing w:beforeLines="50" w:before="218" w:afterLines="50" w:after="218"/>
+        <w:spacing w:beforeLines="50" w:before="218" w:afterLines="50" w:after="218" w:line="360" w:lineRule="auto"/>
         <w:ind w:firstLineChars="200" w:firstLine="480"/>
         <w:jc w:val="both"/>
         <w:rPr>
@@ -3646,7 +3530,7 @@
     </w:p>
     <w:p>
       <w:pPr>
-        <w:spacing w:beforeLines="50" w:before="218" w:afterLines="50" w:after="218"/>
+        <w:spacing w:beforeLines="50" w:before="218" w:afterLines="50" w:after="218" w:line="360" w:lineRule="auto"/>
         <w:ind w:firstLineChars="200" w:firstLine="480"/>
         <w:jc w:val="both"/>
         <w:rPr>
@@ -3824,25 +3708,7 @@
           <w:kern w:val="0"/>
           <w:sz w:val="24"/>
         </w:rPr>
-        <w:t>的层从特征图中为每个候选区域提取一个固定大小的特征向量。这些特征向量随后被</w:t>
-      </w:r>
-      <w:proofErr w:type="gramStart"/>
-      <w:r>
-        <w:rPr>
-          <w:rFonts w:ascii="宋体" w:hAnsi="宋体" w:cs="宋体" w:hint="eastAsia"/>
-          <w:kern w:val="0"/>
-          <w:sz w:val="24"/>
-        </w:rPr>
-        <w:t>送入全</w:t>
-      </w:r>
-      <w:proofErr w:type="gramEnd"/>
-      <w:r>
-        <w:rPr>
-          <w:rFonts w:ascii="宋体" w:hAnsi="宋体" w:cs="宋体" w:hint="eastAsia"/>
-          <w:kern w:val="0"/>
-          <w:sz w:val="24"/>
-        </w:rPr>
-        <w:t>连接层进行分类和边界框回归</w:t>
+        <w:t>的层从特征图中为每个候选区域提取一个固定大小的特征向量。这些特征向量随后被送入全连接层进行分类和边界框回归</w:t>
       </w:r>
       <w:r>
         <w:rPr>
@@ -3887,7 +3753,7 @@
     </w:p>
     <w:p>
       <w:pPr>
-        <w:spacing w:beforeLines="50" w:before="218" w:afterLines="50" w:after="218"/>
+        <w:spacing w:beforeLines="50" w:before="218" w:afterLines="50" w:after="218" w:line="360" w:lineRule="auto"/>
         <w:ind w:firstLineChars="200" w:firstLine="480"/>
         <w:jc w:val="both"/>
         <w:rPr>
@@ -4065,7 +3931,16 @@
           <w:kern w:val="0"/>
           <w:sz w:val="24"/>
         </w:rPr>
-        <w:t>通过将区域提议步骤集成到神经网络内部，</w:t>
+        <w:t>通过将区</w:t>
+      </w:r>
+      <w:r>
+        <w:rPr>
+          <w:rFonts w:ascii="宋体" w:hAnsi="宋体" w:cs="宋体" w:hint="eastAsia"/>
+          <w:kern w:val="0"/>
+          <w:sz w:val="24"/>
+        </w:rPr>
+        <w:lastRenderedPageBreak/>
+        <w:t>域提议步骤集成到神经网络内部，</w:t>
       </w:r>
       <w:r>
         <w:rPr>
@@ -4081,25 +3956,7 @@
           <w:kern w:val="0"/>
           <w:sz w:val="24"/>
         </w:rPr>
-        <w:t>首次实现了近乎实时的端到</w:t>
-      </w:r>
-      <w:proofErr w:type="gramStart"/>
-      <w:r>
-        <w:rPr>
-          <w:rFonts w:ascii="宋体" w:hAnsi="宋体" w:cs="宋体" w:hint="eastAsia"/>
-          <w:kern w:val="0"/>
-          <w:sz w:val="24"/>
-        </w:rPr>
-        <w:t>端目标</w:t>
-      </w:r>
-      <w:proofErr w:type="gramEnd"/>
-      <w:r>
-        <w:rPr>
-          <w:rFonts w:ascii="宋体" w:hAnsi="宋体" w:cs="宋体" w:hint="eastAsia"/>
-          <w:kern w:val="0"/>
-          <w:sz w:val="24"/>
-        </w:rPr>
-        <w:t>检测，成为后续许多两阶段检测算法的基石</w:t>
+        <w:t>首次实现了近乎实时的端到端目标检测，成为后续许多两阶段检测算法的基石</w:t>
       </w:r>
       <w:r>
         <w:rPr>
@@ -4121,11 +3978,11 @@
     <w:p>
       <w:pPr>
         <w:pStyle w:val="ac"/>
-        <w:spacing w:beforeLines="50" w:before="218" w:beforeAutospacing="0" w:afterLines="50" w:after="218" w:afterAutospacing="0"/>
+        <w:spacing w:beforeLines="50" w:before="218" w:beforeAutospacing="0" w:afterLines="50" w:after="218" w:afterAutospacing="0" w:line="360" w:lineRule="auto"/>
         <w:ind w:firstLineChars="200" w:firstLine="480"/>
         <w:jc w:val="both"/>
         <w:rPr>
-          <w:rFonts w:eastAsiaTheme="minorEastAsia"/>
+          <w:rFonts w:eastAsiaTheme="minorEastAsia" w:hint="eastAsia"/>
         </w:rPr>
       </w:pPr>
       <w:r>
@@ -4144,21 +4001,7 @@
         <w:rPr>
           <w:rFonts w:hint="eastAsia"/>
         </w:rPr>
-        <w:t>为代表的两阶段检测算法通常能够达到很高的检测精度，因为它们将定位和分类任务解耦，可以对候选区域进行精细的调整和识别。然而，其多步骤的流程依然带来了较大的计算开销，推理速度相对较慢，难以完全满足道路巡检等需要</w:t>
-      </w:r>
-      <w:proofErr w:type="gramStart"/>
-      <w:r>
-        <w:rPr>
-          <w:rFonts w:hint="eastAsia"/>
-        </w:rPr>
-        <w:t>高帧率</w:t>
-      </w:r>
-      <w:proofErr w:type="gramEnd"/>
-      <w:r>
-        <w:rPr>
-          <w:rFonts w:hint="eastAsia"/>
-        </w:rPr>
-        <w:t>实时处理的任务要求</w:t>
+        <w:t>为代表的两阶段检测算法通常能够达到很高的检测精度，因为它们将定位和分类任务解耦，可以对候选区域进行精细的调整和识别。然而，其多步骤的流程依然带来了较大的计算开销，推理速度相对较慢，难以完全满足道路巡检等需要高帧率实时处理的任务要求</w:t>
       </w:r>
       <w:r>
         <w:rPr>
@@ -4169,7 +4012,7 @@
     </w:p>
     <w:p>
       <w:pPr>
-        <w:spacing w:beforeLines="50" w:before="218" w:afterLines="50" w:after="218" w:line="400" w:lineRule="exact"/>
+        <w:spacing w:beforeLines="50" w:before="218" w:afterLines="50" w:after="218" w:line="360" w:lineRule="auto"/>
         <w:jc w:val="both"/>
         <w:rPr>
           <w:rFonts w:eastAsia="黑体"/>
@@ -4221,7 +4064,7 @@
     <w:p>
       <w:pPr>
         <w:pStyle w:val="ac"/>
-        <w:spacing w:beforeLines="50" w:before="218" w:beforeAutospacing="0" w:afterLines="50" w:after="218" w:afterAutospacing="0"/>
+        <w:spacing w:beforeLines="50" w:before="218" w:beforeAutospacing="0" w:afterLines="50" w:after="218" w:afterAutospacing="0" w:line="360" w:lineRule="auto"/>
         <w:ind w:firstLineChars="200" w:firstLine="480"/>
         <w:jc w:val="both"/>
         <w:rPr>
@@ -4232,49 +4075,7 @@
         <w:rPr>
           <w:rFonts w:hint="eastAsia"/>
         </w:rPr>
-        <w:t>为了解决两阶段算法的速度瓶颈，研究者们提出了将目标检测视为一个端到</w:t>
-      </w:r>
-      <w:proofErr w:type="gramStart"/>
-      <w:r>
-        <w:rPr>
-          <w:rFonts w:hint="eastAsia"/>
-        </w:rPr>
-        <w:t>端回归</w:t>
-      </w:r>
-      <w:proofErr w:type="gramEnd"/>
-      <w:r>
-        <w:rPr>
-          <w:rFonts w:hint="eastAsia"/>
-        </w:rPr>
-        <w:t>问题的</w:t>
-      </w:r>
-      <w:proofErr w:type="gramStart"/>
-      <w:r>
-        <w:rPr>
-          <w:rFonts w:hint="eastAsia"/>
-        </w:rPr>
-        <w:t>单阶段</w:t>
-      </w:r>
-      <w:proofErr w:type="gramEnd"/>
-      <w:r>
-        <w:rPr>
-          <w:rFonts w:hint="eastAsia"/>
-        </w:rPr>
-        <w:t>检测算法。该流派的核心思想是</w:t>
-      </w:r>
-      <w:proofErr w:type="gramStart"/>
-      <w:r>
-        <w:rPr>
-          <w:rFonts w:hint="eastAsia"/>
-        </w:rPr>
-        <w:t>取消了显式</w:t>
-      </w:r>
-      <w:proofErr w:type="gramEnd"/>
-      <w:r>
-        <w:rPr>
-          <w:rFonts w:hint="eastAsia"/>
-        </w:rPr>
-        <w:t>的候选区域生成步骤，直接在整张图像上密集地预测目标的类别和位置，从而极大地简化了检测流程并提升了速度</w:t>
+        <w:t>为了解决两阶段算法的速度瓶颈，研究者们提出了将目标检测视为一个端到端回归问题的单阶段检测算法。该流派的核心思想是取消了显式的候选区域生成步骤，直接在整张图像上密集地预测目标的类别和位置，从而极大地简化了检测流程并提升了速度</w:t>
       </w:r>
       <w:r>
         <w:t>。</w:t>
@@ -4282,7 +4083,7 @@
     </w:p>
     <w:p>
       <w:pPr>
-        <w:spacing w:beforeLines="50" w:before="218" w:afterLines="50" w:after="218"/>
+        <w:spacing w:beforeLines="50" w:before="218" w:afterLines="50" w:after="218" w:line="360" w:lineRule="auto"/>
         <w:ind w:firstLineChars="200" w:firstLine="480"/>
         <w:jc w:val="both"/>
         <w:rPr>
@@ -4529,7 +4330,7 @@
     </w:p>
     <w:p>
       <w:pPr>
-        <w:spacing w:beforeLines="50" w:before="218" w:afterLines="50" w:after="218"/>
+        <w:spacing w:beforeLines="50" w:before="218" w:afterLines="50" w:after="218" w:line="360" w:lineRule="auto"/>
         <w:ind w:firstLineChars="200" w:firstLine="480"/>
         <w:jc w:val="both"/>
         <w:rPr>
@@ -4707,7 +4508,16 @@
           <w:kern w:val="0"/>
           <w:sz w:val="24"/>
         </w:rPr>
-        <w:t>的网格，每个网格单元负责预测其中心落入该单元的目标。每个单元直接回归出若干个边界框的坐标、置信度以及目标的类别概率。这种极其简洁的设计将检测问题完全统一在一个单一的神经网络中，实现了前所未有的检测速度，其基础模型能达到</w:t>
+        <w:t>的网格，每个网格单元负责预测其中心落入该单元的目标。每个单元直接回归出若干个边界框的坐标、置信度以及目</w:t>
+      </w:r>
+      <w:r>
+        <w:rPr>
+          <w:rFonts w:ascii="宋体" w:hAnsi="宋体" w:cs="宋体" w:hint="eastAsia"/>
+          <w:kern w:val="0"/>
+          <w:sz w:val="24"/>
+        </w:rPr>
+        <w:lastRenderedPageBreak/>
+        <w:t>标的类别概率。这种极其简洁的设计将检测问题完全统一在一个单一的神经网络中，实现了前所未有的检测速度，其基础模型能达到</w:t>
       </w:r>
       <w:r>
         <w:rPr>
@@ -4736,7 +4546,7 @@
     </w:p>
     <w:p>
       <w:pPr>
-        <w:spacing w:beforeLines="50" w:before="218" w:afterLines="50" w:after="218"/>
+        <w:spacing w:beforeLines="50" w:before="218" w:afterLines="50" w:after="218" w:line="360" w:lineRule="auto"/>
         <w:ind w:firstLineChars="200" w:firstLine="480"/>
         <w:jc w:val="both"/>
         <w:rPr>
@@ -4822,10 +4632,8 @@
         <w:tblLook w:val="04A0" w:firstRow="1" w:lastRow="0" w:firstColumn="1" w:lastColumn="0" w:noHBand="0" w:noVBand="1"/>
       </w:tblPr>
       <w:tblGrid>
-        <w:gridCol w:w="776"/>
-        <w:gridCol w:w="508"/>
-        <w:gridCol w:w="7026"/>
-        <w:gridCol w:w="752"/>
+        <w:gridCol w:w="899"/>
+        <w:gridCol w:w="8163"/>
       </w:tblGrid>
       <w:tr>
         <w:trPr>
@@ -4884,61 +4692,7 @@
                 <w:b/>
                 <w:bCs/>
               </w:rPr>
-              <w:t>提出年份</w:t>
-            </w:r>
-            <w:proofErr w:type="spellEnd"/>
-          </w:p>
-        </w:tc>
-        <w:tc>
-          <w:tcPr>
-            <w:tcW w:w="0" w:type="auto"/>
-            <w:vAlign w:val="center"/>
-            <w:hideMark/>
-          </w:tcPr>
-          <w:p>
-            <w:pPr>
-              <w:jc w:val="center"/>
-              <w:rPr>
-                <w:rFonts w:eastAsia="Times New Roman"/>
-                <w:b/>
-                <w:bCs/>
-              </w:rPr>
-            </w:pPr>
-            <w:proofErr w:type="spellStart"/>
-            <w:r>
-              <w:rPr>
-                <w:rFonts w:eastAsia="Times New Roman"/>
-                <w:b/>
-                <w:bCs/>
-              </w:rPr>
               <w:t>核心贡献与创新点</w:t>
-            </w:r>
-            <w:proofErr w:type="spellEnd"/>
-          </w:p>
-        </w:tc>
-        <w:tc>
-          <w:tcPr>
-            <w:tcW w:w="0" w:type="auto"/>
-            <w:vAlign w:val="center"/>
-            <w:hideMark/>
-          </w:tcPr>
-          <w:p>
-            <w:pPr>
-              <w:jc w:val="center"/>
-              <w:rPr>
-                <w:rFonts w:eastAsia="Times New Roman"/>
-                <w:b/>
-                <w:bCs/>
-              </w:rPr>
-            </w:pPr>
-            <w:proofErr w:type="spellStart"/>
-            <w:r>
-              <w:rPr>
-                <w:rFonts w:eastAsia="Times New Roman"/>
-                <w:b/>
-                <w:bCs/>
-              </w:rPr>
-              <w:t>主要参考文献</w:t>
             </w:r>
             <w:proofErr w:type="spellEnd"/>
           </w:p>
@@ -4968,27 +4722,6 @@
                 <w:rFonts w:eastAsia="Times New Roman"/>
               </w:rPr>
               <w:t>YOLOv1</w:t>
-            </w:r>
-          </w:p>
-        </w:tc>
-        <w:tc>
-          <w:tcPr>
-            <w:tcW w:w="0" w:type="auto"/>
-            <w:vAlign w:val="center"/>
-            <w:hideMark/>
-          </w:tcPr>
-          <w:p>
-            <w:pPr>
-              <w:jc w:val="center"/>
-              <w:rPr>
-                <w:rFonts w:eastAsia="Times New Roman"/>
-              </w:rPr>
-            </w:pPr>
-            <w:r>
-              <w:rPr>
-                <w:rFonts w:eastAsia="Times New Roman"/>
-              </w:rPr>
-              <w:t>2016</w:t>
             </w:r>
           </w:p>
         </w:tc>
@@ -5080,27 +4813,6 @@
             </w:r>
           </w:p>
         </w:tc>
-        <w:tc>
-          <w:tcPr>
-            <w:tcW w:w="0" w:type="auto"/>
-            <w:vAlign w:val="center"/>
-            <w:hideMark/>
-          </w:tcPr>
-          <w:p>
-            <w:pPr>
-              <w:jc w:val="center"/>
-              <w:rPr>
-                <w:rFonts w:eastAsia="Times New Roman"/>
-              </w:rPr>
-            </w:pPr>
-            <w:r>
-              <w:rPr>
-                <w:rFonts w:eastAsia="Times New Roman"/>
-              </w:rPr>
-              <w:t>Redmon et al.</w:t>
-            </w:r>
-          </w:p>
-        </w:tc>
       </w:tr>
       <w:tr>
         <w:trPr>
@@ -5126,27 +4838,6 @@
                 <w:rFonts w:eastAsia="Times New Roman"/>
               </w:rPr>
               <w:t>YOLOv2/9000</w:t>
-            </w:r>
-          </w:p>
-        </w:tc>
-        <w:tc>
-          <w:tcPr>
-            <w:tcW w:w="0" w:type="auto"/>
-            <w:vAlign w:val="center"/>
-            <w:hideMark/>
-          </w:tcPr>
-          <w:p>
-            <w:pPr>
-              <w:jc w:val="center"/>
-              <w:rPr>
-                <w:rFonts w:eastAsia="Times New Roman"/>
-              </w:rPr>
-            </w:pPr>
-            <w:r>
-              <w:rPr>
-                <w:rFonts w:eastAsia="Times New Roman"/>
-              </w:rPr>
-              <w:t>2017</w:t>
             </w:r>
           </w:p>
         </w:tc>
@@ -5236,27 +4927,6 @@
             </w:r>
           </w:p>
         </w:tc>
-        <w:tc>
-          <w:tcPr>
-            <w:tcW w:w="0" w:type="auto"/>
-            <w:vAlign w:val="center"/>
-            <w:hideMark/>
-          </w:tcPr>
-          <w:p>
-            <w:pPr>
-              <w:jc w:val="center"/>
-              <w:rPr>
-                <w:rFonts w:eastAsia="Times New Roman"/>
-              </w:rPr>
-            </w:pPr>
-            <w:r>
-              <w:rPr>
-                <w:rFonts w:eastAsia="Times New Roman"/>
-              </w:rPr>
-              <w:t>Redmon &amp; Farhadi</w:t>
-            </w:r>
-          </w:p>
-        </w:tc>
       </w:tr>
       <w:tr>
         <w:trPr>
@@ -5282,27 +4952,6 @@
                 <w:rFonts w:eastAsia="Times New Roman"/>
               </w:rPr>
               <w:t>YOLOv3</w:t>
-            </w:r>
-          </w:p>
-        </w:tc>
-        <w:tc>
-          <w:tcPr>
-            <w:tcW w:w="0" w:type="auto"/>
-            <w:vAlign w:val="center"/>
-            <w:hideMark/>
-          </w:tcPr>
-          <w:p>
-            <w:pPr>
-              <w:jc w:val="center"/>
-              <w:rPr>
-                <w:rFonts w:eastAsia="Times New Roman"/>
-              </w:rPr>
-            </w:pPr>
-            <w:r>
-              <w:rPr>
-                <w:rFonts w:eastAsia="Times New Roman"/>
-              </w:rPr>
-              <w:t>2018</w:t>
             </w:r>
           </w:p>
         </w:tc>
@@ -5392,27 +5041,6 @@
             </w:r>
           </w:p>
         </w:tc>
-        <w:tc>
-          <w:tcPr>
-            <w:tcW w:w="0" w:type="auto"/>
-            <w:vAlign w:val="center"/>
-            <w:hideMark/>
-          </w:tcPr>
-          <w:p>
-            <w:pPr>
-              <w:jc w:val="center"/>
-              <w:rPr>
-                <w:rFonts w:eastAsia="Times New Roman"/>
-              </w:rPr>
-            </w:pPr>
-            <w:r>
-              <w:rPr>
-                <w:rFonts w:eastAsia="Times New Roman"/>
-              </w:rPr>
-              <w:t>Redmon &amp; Farhadi</w:t>
-            </w:r>
-          </w:p>
-        </w:tc>
       </w:tr>
       <w:tr>
         <w:trPr>
@@ -5438,27 +5066,6 @@
                 <w:rFonts w:eastAsia="Times New Roman"/>
               </w:rPr>
               <w:t>YOLOv4</w:t>
-            </w:r>
-          </w:p>
-        </w:tc>
-        <w:tc>
-          <w:tcPr>
-            <w:tcW w:w="0" w:type="auto"/>
-            <w:vAlign w:val="center"/>
-            <w:hideMark/>
-          </w:tcPr>
-          <w:p>
-            <w:pPr>
-              <w:jc w:val="center"/>
-              <w:rPr>
-                <w:rFonts w:eastAsia="Times New Roman"/>
-              </w:rPr>
-            </w:pPr>
-            <w:r>
-              <w:rPr>
-                <w:rFonts w:eastAsia="Times New Roman"/>
-              </w:rPr>
-              <w:t>2020</w:t>
             </w:r>
           </w:p>
         </w:tc>
@@ -5590,35 +5197,6 @@
             </w:r>
           </w:p>
         </w:tc>
-        <w:tc>
-          <w:tcPr>
-            <w:tcW w:w="0" w:type="auto"/>
-            <w:vAlign w:val="center"/>
-            <w:hideMark/>
-          </w:tcPr>
-          <w:p>
-            <w:pPr>
-              <w:jc w:val="center"/>
-              <w:rPr>
-                <w:rFonts w:eastAsia="Times New Roman"/>
-              </w:rPr>
-            </w:pPr>
-            <w:proofErr w:type="spellStart"/>
-            <w:r>
-              <w:rPr>
-                <w:rFonts w:eastAsia="Times New Roman"/>
-              </w:rPr>
-              <w:t>Bochkovskiy</w:t>
-            </w:r>
-            <w:proofErr w:type="spellEnd"/>
-            <w:r>
-              <w:rPr>
-                <w:rFonts w:eastAsia="Times New Roman"/>
-              </w:rPr>
-              <w:t xml:space="preserve"> et al.</w:t>
-            </w:r>
-          </w:p>
-        </w:tc>
       </w:tr>
       <w:tr>
         <w:trPr>
@@ -5644,27 +5222,6 @@
                 <w:rFonts w:eastAsia="Times New Roman"/>
               </w:rPr>
               <w:t>YOLOv5</w:t>
-            </w:r>
-          </w:p>
-        </w:tc>
-        <w:tc>
-          <w:tcPr>
-            <w:tcW w:w="0" w:type="auto"/>
-            <w:vAlign w:val="center"/>
-            <w:hideMark/>
-          </w:tcPr>
-          <w:p>
-            <w:pPr>
-              <w:jc w:val="center"/>
-              <w:rPr>
-                <w:rFonts w:eastAsia="Times New Roman"/>
-              </w:rPr>
-            </w:pPr>
-            <w:r>
-              <w:rPr>
-                <w:rFonts w:eastAsia="Times New Roman"/>
-              </w:rPr>
-              <w:t>2020</w:t>
             </w:r>
           </w:p>
         </w:tc>
@@ -5756,29 +5313,6 @@
             </w:r>
           </w:p>
         </w:tc>
-        <w:tc>
-          <w:tcPr>
-            <w:tcW w:w="0" w:type="auto"/>
-            <w:vAlign w:val="center"/>
-            <w:hideMark/>
-          </w:tcPr>
-          <w:p>
-            <w:pPr>
-              <w:jc w:val="center"/>
-              <w:rPr>
-                <w:rFonts w:eastAsia="Times New Roman"/>
-              </w:rPr>
-            </w:pPr>
-            <w:proofErr w:type="spellStart"/>
-            <w:r>
-              <w:rPr>
-                <w:rFonts w:eastAsia="Times New Roman"/>
-              </w:rPr>
-              <w:t>Ultralytics</w:t>
-            </w:r>
-            <w:proofErr w:type="spellEnd"/>
-          </w:p>
-        </w:tc>
       </w:tr>
       <w:tr>
         <w:trPr>
@@ -5804,27 +5338,6 @@
                 <w:rFonts w:eastAsia="Times New Roman"/>
               </w:rPr>
               <w:t>YOLOv8</w:t>
-            </w:r>
-          </w:p>
-        </w:tc>
-        <w:tc>
-          <w:tcPr>
-            <w:tcW w:w="0" w:type="auto"/>
-            <w:vAlign w:val="center"/>
-            <w:hideMark/>
-          </w:tcPr>
-          <w:p>
-            <w:pPr>
-              <w:jc w:val="center"/>
-              <w:rPr>
-                <w:rFonts w:eastAsia="Times New Roman"/>
-              </w:rPr>
-            </w:pPr>
-            <w:r>
-              <w:rPr>
-                <w:rFonts w:eastAsia="Times New Roman"/>
-              </w:rPr>
-              <w:t>2023</w:t>
             </w:r>
           </w:p>
         </w:tc>
@@ -5914,29 +5427,6 @@
             </w:r>
           </w:p>
         </w:tc>
-        <w:tc>
-          <w:tcPr>
-            <w:tcW w:w="0" w:type="auto"/>
-            <w:vAlign w:val="center"/>
-            <w:hideMark/>
-          </w:tcPr>
-          <w:p>
-            <w:pPr>
-              <w:jc w:val="center"/>
-              <w:rPr>
-                <w:rFonts w:eastAsia="Times New Roman"/>
-              </w:rPr>
-            </w:pPr>
-            <w:proofErr w:type="spellStart"/>
-            <w:r>
-              <w:rPr>
-                <w:rFonts w:eastAsia="Times New Roman"/>
-              </w:rPr>
-              <w:t>Ultralytics</w:t>
-            </w:r>
-            <w:proofErr w:type="spellEnd"/>
-          </w:p>
-        </w:tc>
       </w:tr>
       <w:tr>
         <w:trPr>
@@ -5962,27 +5452,6 @@
                 <w:rFonts w:eastAsia="Times New Roman"/>
               </w:rPr>
               <w:t>YOLOv9</w:t>
-            </w:r>
-          </w:p>
-        </w:tc>
-        <w:tc>
-          <w:tcPr>
-            <w:tcW w:w="0" w:type="auto"/>
-            <w:vAlign w:val="center"/>
-            <w:hideMark/>
-          </w:tcPr>
-          <w:p>
-            <w:pPr>
-              <w:jc w:val="center"/>
-              <w:rPr>
-                <w:rFonts w:eastAsia="Times New Roman"/>
-              </w:rPr>
-            </w:pPr>
-            <w:r>
-              <w:rPr>
-                <w:rFonts w:eastAsia="Times New Roman"/>
-              </w:rPr>
-              <w:t>2024</w:t>
             </w:r>
           </w:p>
         </w:tc>
@@ -6072,33 +5541,46 @@
             </w:r>
           </w:p>
         </w:tc>
-        <w:tc>
-          <w:tcPr>
-            <w:tcW w:w="0" w:type="auto"/>
-            <w:vAlign w:val="center"/>
-            <w:hideMark/>
-          </w:tcPr>
-          <w:p>
-            <w:pPr>
-              <w:jc w:val="center"/>
-              <w:rPr>
-                <w:rFonts w:eastAsia="Times New Roman"/>
-              </w:rPr>
-            </w:pPr>
-            <w:r>
-              <w:rPr>
-                <w:rFonts w:eastAsia="Times New Roman"/>
-              </w:rPr>
-              <w:t>Wang et al.</w:t>
-            </w:r>
-          </w:p>
-        </w:tc>
       </w:tr>
     </w:tbl>
     <w:p>
       <w:pPr>
         <w:pStyle w:val="ac"/>
-        <w:spacing w:beforeLines="50" w:before="218" w:beforeAutospacing="0" w:afterLines="50" w:after="218" w:afterAutospacing="0"/>
+        <w:spacing w:beforeLines="50" w:before="218" w:beforeAutospacing="0" w:afterLines="50" w:after="218" w:afterAutospacing="0" w:line="360" w:lineRule="auto"/>
+        <w:jc w:val="center"/>
+        <w:rPr>
+          <w:rFonts w:cs="Times New Roman" w:hint="eastAsia"/>
+        </w:rPr>
+      </w:pPr>
+      <w:r>
+        <w:rPr>
+          <w:rFonts w:cs="Times New Roman" w:hint="eastAsia"/>
+        </w:rPr>
+        <w:t>表1</w:t>
+      </w:r>
+      <w:r>
+        <w:rPr>
+          <w:rFonts w:hint="eastAsia"/>
+        </w:rPr>
+        <w:t>：</w:t>
+      </w:r>
+      <w:r>
+        <w:rPr>
+          <w:rFonts w:hint="eastAsia"/>
+        </w:rPr>
+        <w:t>历代YOLO模型</w:t>
+      </w:r>
+      <w:r>
+        <w:rPr>
+          <w:rFonts w:hint="eastAsia"/>
+        </w:rPr>
+        <w:t>核心贡献与创新点</w:t>
+      </w:r>
+    </w:p>
+    <w:p>
+      <w:pPr>
+        <w:pStyle w:val="ac"/>
+        <w:spacing w:beforeLines="50" w:before="218" w:beforeAutospacing="0" w:afterLines="50" w:after="218" w:afterAutospacing="0" w:line="360" w:lineRule="auto"/>
         <w:ind w:firstLineChars="200" w:firstLine="480"/>
         <w:jc w:val="both"/>
         <w:rPr>
@@ -6153,12 +5635,14 @@
         </w:rPr>
         <w:t>）以及更高分辨率的输入等一系列改进，显著提升了模型的</w:t>
       </w:r>
+      <w:proofErr w:type="spellStart"/>
       <w:r>
         <w:rPr>
           <w:rFonts w:ascii="Times New Roman" w:eastAsia="Times New Roman" w:hAnsi="Times New Roman" w:cs="Times New Roman"/>
         </w:rPr>
         <w:t>mAP</w:t>
       </w:r>
+      <w:proofErr w:type="spellEnd"/>
       <w:r>
         <w:fldChar w:fldCharType="begin"/>
       </w:r>
@@ -6267,7 +5751,14 @@
         <w:rPr>
           <w:rFonts w:hint="eastAsia"/>
         </w:rPr>
-        <w:t>则是一次集大成式的更新，其作者系统地测试并融合了大量当时最先进的优化技术，如</w:t>
+        <w:t>则是一次集大成式的更新，其作者</w:t>
+      </w:r>
+      <w:r>
+        <w:rPr>
+          <w:rFonts w:hint="eastAsia"/>
+        </w:rPr>
+        <w:lastRenderedPageBreak/>
+        <w:t>系统地测试并融合了大量当时最先进的优化技术，如</w:t>
       </w:r>
       <w:r>
         <w:rPr>
@@ -6535,29 +6026,18 @@
     <w:p>
       <w:pPr>
         <w:pStyle w:val="ac"/>
-        <w:spacing w:beforeLines="50" w:before="218" w:beforeAutospacing="0" w:afterLines="50" w:after="218" w:afterAutospacing="0"/>
+        <w:spacing w:beforeLines="50" w:before="218" w:beforeAutospacing="0" w:afterLines="50" w:after="218" w:afterAutospacing="0" w:line="360" w:lineRule="auto"/>
         <w:ind w:firstLineChars="200" w:firstLine="480"/>
         <w:jc w:val="both"/>
-      </w:pPr>
-      <w:r>
-        <w:rPr>
-          <w:rFonts w:hint="eastAsia"/>
-        </w:rPr>
-        <w:t>这种将检测速度与精度进行有效平衡的设计，使得</w:t>
-      </w:r>
-      <w:proofErr w:type="gramStart"/>
-      <w:r>
-        <w:rPr>
-          <w:rFonts w:hint="eastAsia"/>
-        </w:rPr>
-        <w:t>单阶段</w:t>
-      </w:r>
-      <w:proofErr w:type="gramEnd"/>
-      <w:r>
-        <w:rPr>
-          <w:rFonts w:hint="eastAsia"/>
-        </w:rPr>
-        <w:t>检测器，特别是</w:t>
+        <w:rPr>
+          <w:rFonts w:hint="eastAsia"/>
+        </w:rPr>
+      </w:pPr>
+      <w:r>
+        <w:rPr>
+          <w:rFonts w:hint="eastAsia"/>
+        </w:rPr>
+        <w:t>这种将检测速度与精度进行有效平衡的设计，使得单阶段检测器，特别是</w:t>
       </w:r>
       <w:r>
         <w:rPr>
@@ -6580,7 +6060,7 @@
     </w:p>
     <w:p>
       <w:pPr>
-        <w:spacing w:beforeLines="50" w:before="218" w:afterLines="50" w:after="218" w:line="400" w:lineRule="exact"/>
+        <w:spacing w:beforeLines="50" w:before="218" w:afterLines="50" w:after="218" w:line="360" w:lineRule="auto"/>
         <w:jc w:val="both"/>
         <w:rPr>
           <w:rFonts w:eastAsia="黑体"/>
@@ -6624,7 +6104,7 @@
     <w:p>
       <w:pPr>
         <w:pStyle w:val="ac"/>
-        <w:spacing w:beforeLines="50" w:before="218" w:beforeAutospacing="0" w:afterLines="50" w:after="218" w:afterAutospacing="0"/>
+        <w:spacing w:beforeLines="50" w:before="218" w:beforeAutospacing="0" w:afterLines="50" w:after="218" w:afterAutospacing="0" w:line="360" w:lineRule="auto"/>
         <w:ind w:firstLineChars="200" w:firstLine="480"/>
         <w:jc w:val="both"/>
         <w:rPr>
@@ -6647,35 +6127,7 @@
         <w:rPr>
           <w:rFonts w:hint="eastAsia"/>
         </w:rPr>
-        <w:t>为代表的深度学习模型性能强大，但在实际部署中，尤其是在算力、内存和</w:t>
-      </w:r>
-      <w:proofErr w:type="gramStart"/>
-      <w:r>
-        <w:rPr>
-          <w:rFonts w:hint="eastAsia"/>
-        </w:rPr>
-        <w:t>功耗均</w:t>
-      </w:r>
-      <w:proofErr w:type="gramEnd"/>
-      <w:r>
-        <w:rPr>
-          <w:rFonts w:hint="eastAsia"/>
-        </w:rPr>
-        <w:t>受限的车载边缘计算设备上，模型的大小和计算复杂</w:t>
-      </w:r>
-      <w:proofErr w:type="gramStart"/>
-      <w:r>
-        <w:rPr>
-          <w:rFonts w:hint="eastAsia"/>
-        </w:rPr>
-        <w:t>度成为</w:t>
-      </w:r>
-      <w:proofErr w:type="gramEnd"/>
-      <w:r>
-        <w:rPr>
-          <w:rFonts w:hint="eastAsia"/>
-        </w:rPr>
-        <w:t>关键瓶颈。为此，学术界和工业界正积极探索模型优化技术，旨在实现一个能够在精度、速度和模型大小之间取得更优平衡的解决方案。这一研究方向的成熟，体现了计算机视觉领域从追求纯粹的理论精度，向关注实际应用部署的范式转变。两个主要的研究方向是模型轻量化和注意力机制</w:t>
+        <w:t>为代表的深度学习模型性能强大，但在实际部署中，尤其是在算力、内存和功耗均受限的车载边缘计算设备上，模型的大小和计算复杂度成为关键瓶颈。为此，学术界和工业界正积极探索模型优化技术，旨在实现一个能够在精度、速度和模型大小之间取得更优平衡的解决方案。这一研究方向的成熟，体现了计算机视觉领域从追求纯粹的理论精度，向关注实际应用部署的范式转变。两个主要的研究方向是模型轻量化和注意力机制</w:t>
       </w:r>
       <w:r>
         <w:t>。</w:t>
@@ -6683,7 +6135,7 @@
     </w:p>
     <w:p>
       <w:pPr>
-        <w:spacing w:before="100" w:beforeAutospacing="1" w:after="100" w:afterAutospacing="1"/>
+        <w:spacing w:before="100" w:beforeAutospacing="1" w:after="100" w:afterAutospacing="1" w:line="360" w:lineRule="auto"/>
         <w:rPr>
           <w:rFonts w:eastAsia="Times New Roman"/>
           <w:kern w:val="0"/>
@@ -6717,7 +6169,7 @@
     </w:p>
     <w:p>
       <w:pPr>
-        <w:spacing w:beforeLines="50" w:before="218" w:afterLines="50" w:after="218"/>
+        <w:spacing w:beforeLines="50" w:before="218" w:afterLines="50" w:after="218" w:line="360" w:lineRule="auto"/>
         <w:ind w:firstLineChars="200" w:firstLine="480"/>
         <w:jc w:val="both"/>
         <w:rPr>
@@ -6761,7 +6213,7 @@
     </w:p>
     <w:p>
       <w:pPr>
-        <w:spacing w:beforeLines="50" w:before="218" w:afterLines="50" w:after="218"/>
+        <w:spacing w:beforeLines="50" w:before="218" w:afterLines="50" w:after="218" w:line="360" w:lineRule="auto"/>
         <w:ind w:firstLineChars="200" w:firstLine="480"/>
         <w:jc w:val="both"/>
         <w:rPr>
@@ -6776,6 +6228,7 @@
           <w:kern w:val="0"/>
           <w:sz w:val="24"/>
         </w:rPr>
+        <w:lastRenderedPageBreak/>
         <w:t>Howard</w:t>
       </w:r>
       <w:r>
@@ -7083,7 +6536,7 @@
     </w:p>
     <w:p>
       <w:pPr>
-        <w:spacing w:beforeLines="50" w:before="218" w:afterLines="50" w:after="218"/>
+        <w:spacing w:beforeLines="50" w:before="218" w:afterLines="50" w:after="218" w:line="360" w:lineRule="auto"/>
         <w:ind w:firstLineChars="200" w:firstLine="480"/>
         <w:jc w:val="both"/>
         <w:rPr>
@@ -7373,7 +6826,7 @@
     </w:p>
     <w:p>
       <w:pPr>
-        <w:spacing w:beforeLines="50" w:before="218" w:afterLines="50" w:after="218"/>
+        <w:spacing w:beforeLines="50" w:before="218" w:afterLines="50" w:after="218" w:line="360" w:lineRule="auto"/>
         <w:ind w:firstLineChars="200" w:firstLine="480"/>
         <w:jc w:val="both"/>
         <w:rPr>
@@ -7596,7 +7049,7 @@
     </w:p>
     <w:p>
       <w:pPr>
-        <w:spacing w:before="100" w:beforeAutospacing="1" w:after="100" w:afterAutospacing="1"/>
+        <w:spacing w:before="100" w:beforeAutospacing="1" w:after="100" w:afterAutospacing="1" w:line="360" w:lineRule="auto"/>
         <w:rPr>
           <w:rFonts w:eastAsia="黑体"/>
           <w:color w:val="000000" w:themeColor="text1"/>
@@ -7622,7 +7075,7 @@
     </w:p>
     <w:p>
       <w:pPr>
-        <w:spacing w:beforeLines="50" w:before="218" w:afterLines="50" w:after="218"/>
+        <w:spacing w:beforeLines="50" w:before="218" w:afterLines="50" w:after="218" w:line="360" w:lineRule="auto"/>
         <w:ind w:firstLineChars="200" w:firstLine="480"/>
         <w:rPr>
           <w:rFonts w:eastAsia="Times New Roman"/>
@@ -7649,7 +7102,7 @@
     </w:p>
     <w:p>
       <w:pPr>
-        <w:spacing w:beforeLines="50" w:before="218" w:afterLines="50" w:after="218"/>
+        <w:spacing w:beforeLines="50" w:before="218" w:afterLines="50" w:after="218" w:line="360" w:lineRule="auto"/>
         <w:ind w:firstLineChars="200" w:firstLine="480"/>
         <w:rPr>
           <w:rFonts w:eastAsia="Times New Roman"/>
@@ -7663,6 +7116,7 @@
           <w:kern w:val="0"/>
           <w:sz w:val="24"/>
         </w:rPr>
+        <w:lastRenderedPageBreak/>
         <w:t>Hu</w:t>
       </w:r>
       <w:r>
@@ -7903,7 +7357,7 @@
     </w:p>
     <w:p>
       <w:pPr>
-        <w:spacing w:beforeLines="50" w:before="218" w:afterLines="50" w:after="218"/>
+        <w:spacing w:beforeLines="50" w:before="218" w:afterLines="50" w:after="218" w:line="360" w:lineRule="auto"/>
         <w:ind w:firstLineChars="200" w:firstLine="480"/>
         <w:rPr>
           <w:rFonts w:eastAsia="Times New Roman"/>
@@ -8125,7 +7579,7 @@
     </w:p>
     <w:p>
       <w:pPr>
-        <w:spacing w:beforeLines="50" w:before="218" w:afterLines="50" w:after="218"/>
+        <w:spacing w:beforeLines="50" w:before="218" w:afterLines="50" w:after="218" w:line="360" w:lineRule="auto"/>
         <w:ind w:firstLineChars="200" w:firstLine="480"/>
         <w:rPr>
           <w:rFonts w:eastAsiaTheme="minorEastAsia"/>
@@ -8286,25 +7740,7 @@
           <w:kern w:val="0"/>
           <w:sz w:val="24"/>
         </w:rPr>
-        <w:t>的突出特点是无需任何额外的参数。它基于神经科学中的空间抑制理论，为特征图中的每个神经元（即每个位置的每个通道）定义一个能量函数。通过</w:t>
-      </w:r>
-      <w:proofErr w:type="gramStart"/>
-      <w:r>
-        <w:rPr>
-          <w:rFonts w:ascii="宋体" w:hAnsi="宋体" w:cs="宋体" w:hint="eastAsia"/>
-          <w:kern w:val="0"/>
-          <w:sz w:val="24"/>
-        </w:rPr>
-        <w:t>最小化该能量</w:t>
-      </w:r>
-      <w:proofErr w:type="gramEnd"/>
-      <w:r>
-        <w:rPr>
-          <w:rFonts w:ascii="宋体" w:hAnsi="宋体" w:cs="宋体" w:hint="eastAsia"/>
-          <w:kern w:val="0"/>
-          <w:sz w:val="24"/>
-        </w:rPr>
-        <w:t>函数，</w:t>
+        <w:t>的突出特点是无需任何额外的参数。它基于神经科学中的空间抑制理论，为特征图中的每个神经元（即每个位置的每个通道）定义一个能量函数。通过最小化该能量函数，</w:t>
       </w:r>
       <w:r>
         <w:rPr>
@@ -8373,7 +7809,7 @@
     </w:p>
     <w:p>
       <w:pPr>
-        <w:spacing w:beforeLines="50" w:before="218" w:afterLines="50" w:after="218"/>
+        <w:spacing w:beforeLines="50" w:before="218" w:afterLines="50" w:after="218" w:line="360" w:lineRule="auto"/>
         <w:jc w:val="both"/>
         <w:rPr>
           <w:rFonts w:eastAsia="黑体"/>
@@ -8422,7 +7858,7 @@
     <w:p>
       <w:pPr>
         <w:pStyle w:val="ac"/>
-        <w:spacing w:beforeLines="50" w:before="218" w:beforeAutospacing="0" w:afterLines="50" w:after="218" w:afterAutospacing="0"/>
+        <w:spacing w:beforeLines="50" w:before="218" w:beforeAutospacing="0" w:afterLines="50" w:after="218" w:afterAutospacing="0" w:line="360" w:lineRule="auto"/>
         <w:ind w:firstLineChars="200" w:firstLine="480"/>
         <w:jc w:val="both"/>
         <w:rPr>
@@ -8433,7 +7869,14 @@
         <w:rPr>
           <w:rFonts w:hint="eastAsia"/>
         </w:rPr>
-        <w:t>深度学习模型的研发与进步离不开大规模、高质量的公开数据集，它们为算法的训练、验证和公平比较提供了基石。在道路病害检测领域，一个国际权威且被广泛使用的数据集是</w:t>
+        <w:t>深度学习模型的研发与进步离不开大规模、高质量的公开数据集，它们为算法的训练、验证和公平比较提供了基石。在道路病害检测领域，一个国际权威且被广泛使用的</w:t>
+      </w:r>
+      <w:r>
+        <w:rPr>
+          <w:rFonts w:hint="eastAsia"/>
+        </w:rPr>
+        <w:lastRenderedPageBreak/>
+        <w:t>数据集是</w:t>
       </w:r>
       <w:r>
         <w:rPr>
@@ -8571,7 +8014,7 @@
     </w:p>
     <w:p>
       <w:pPr>
-        <w:spacing w:beforeLines="50" w:before="218" w:afterLines="50" w:after="218"/>
+        <w:spacing w:beforeLines="50" w:before="218" w:afterLines="50" w:after="218" w:line="360" w:lineRule="auto"/>
         <w:ind w:firstLineChars="200" w:firstLine="480"/>
         <w:jc w:val="both"/>
         <w:rPr>
@@ -8730,7 +8173,7 @@
     </w:p>
     <w:p>
       <w:pPr>
-        <w:spacing w:beforeLines="50" w:before="218" w:afterLines="50" w:after="218"/>
+        <w:spacing w:beforeLines="50" w:before="218" w:afterLines="50" w:after="218" w:line="360" w:lineRule="auto"/>
         <w:ind w:firstLineChars="200" w:firstLine="480"/>
         <w:jc w:val="both"/>
         <w:rPr>
@@ -8889,7 +8332,7 @@
     </w:p>
     <w:p>
       <w:pPr>
-        <w:spacing w:beforeLines="50" w:before="218" w:afterLines="50" w:after="218"/>
+        <w:spacing w:beforeLines="50" w:before="218" w:afterLines="50" w:after="218" w:line="360" w:lineRule="auto"/>
         <w:ind w:firstLineChars="200" w:firstLine="480"/>
         <w:jc w:val="both"/>
         <w:rPr>
@@ -8904,25 +8347,7 @@
           <w:kern w:val="0"/>
           <w:sz w:val="24"/>
         </w:rPr>
-        <w:t>然而，在目标检测任务中，</w:t>
-      </w:r>
-      <w:proofErr w:type="gramStart"/>
-      <w:r>
-        <w:rPr>
-          <w:rFonts w:ascii="宋体" w:hAnsi="宋体" w:cs="宋体" w:hint="eastAsia"/>
-          <w:kern w:val="0"/>
-          <w:sz w:val="24"/>
-        </w:rPr>
-        <w:t>最</w:t>
-      </w:r>
-      <w:proofErr w:type="gramEnd"/>
-      <w:r>
-        <w:rPr>
-          <w:rFonts w:ascii="宋体" w:hAnsi="宋体" w:cs="宋体" w:hint="eastAsia"/>
-          <w:kern w:val="0"/>
-          <w:sz w:val="24"/>
-        </w:rPr>
-        <w:t>核心的综合性能指标是平均精度均值（</w:t>
+        <w:t>然而，在目标检测任务中，最核心的综合性能指标是平均精度均值（</w:t>
       </w:r>
       <w:r>
         <w:rPr>
@@ -9224,7 +8649,7 @@
     </w:p>
     <w:p>
       <w:pPr>
-        <w:spacing w:beforeLines="50" w:before="218" w:afterLines="50" w:after="218"/>
+        <w:spacing w:beforeLines="50" w:before="218" w:afterLines="50" w:after="218" w:line="360" w:lineRule="auto"/>
         <w:ind w:firstLineChars="200" w:firstLine="480"/>
         <w:jc w:val="both"/>
         <w:rPr>
@@ -9239,6 +8664,7 @@
           <w:kern w:val="0"/>
           <w:sz w:val="24"/>
         </w:rPr>
+        <w:lastRenderedPageBreak/>
         <w:t>此外，对于道路巡检这类要求实时性的应用场景，模型的推理速度是一个至关重要的评估维度。该指标通常用每秒处理的图像帧数（</w:t>
       </w:r>
       <w:r>
@@ -9317,6 +8743,7 @@
     <w:p>
       <w:pPr>
         <w:pStyle w:val="aa"/>
+        <w:spacing w:line="360" w:lineRule="auto"/>
         <w:jc w:val="left"/>
         <w:rPr>
           <w:rFonts w:ascii="Times New Roman" w:eastAsia="黑体" w:hAnsi="Times New Roman"/>
@@ -9347,7 +8774,7 @@
     <w:p>
       <w:pPr>
         <w:pStyle w:val="ac"/>
-        <w:spacing w:beforeLines="50" w:before="218" w:beforeAutospacing="0" w:afterLines="50" w:after="218" w:afterAutospacing="0"/>
+        <w:spacing w:beforeLines="50" w:before="218" w:beforeAutospacing="0" w:afterLines="50" w:after="218" w:afterAutospacing="0" w:line="360" w:lineRule="auto"/>
         <w:ind w:firstLineChars="200" w:firstLine="480"/>
         <w:jc w:val="both"/>
         <w:rPr>
@@ -9556,21 +8983,7 @@
         <w:rPr>
           <w:rFonts w:hint="eastAsia"/>
         </w:rPr>
-        <w:t>系列为代表的</w:t>
-      </w:r>
-      <w:proofErr w:type="gramStart"/>
-      <w:r>
-        <w:rPr>
-          <w:rFonts w:hint="eastAsia"/>
-        </w:rPr>
-        <w:t>单阶段</w:t>
-      </w:r>
-      <w:proofErr w:type="gramEnd"/>
-      <w:r>
-        <w:rPr>
-          <w:rFonts w:hint="eastAsia"/>
-        </w:rPr>
-        <w:t>目标检测算法，凭借其在实时性与精度上取得的良好平衡，已成为该领域的主流选择</w:t>
+        <w:t>系列为代表的单阶段目标检测算法，凭借其在实时性与精度上取得的良好平衡，已成为该领域的主流选择</w:t>
       </w:r>
       <w:r>
         <w:rPr>
@@ -9581,7 +8994,7 @@
     </w:p>
     <w:p>
       <w:pPr>
-        <w:spacing w:beforeLines="50" w:before="218" w:afterLines="50" w:after="218"/>
+        <w:spacing w:beforeLines="50" w:before="218" w:afterLines="50" w:after="218" w:line="360" w:lineRule="auto"/>
         <w:ind w:firstLineChars="200" w:firstLine="480"/>
         <w:jc w:val="both"/>
         <w:rPr>
@@ -9671,7 +9084,16 @@
           <w:kern w:val="0"/>
           <w:sz w:val="24"/>
         </w:rPr>
-        <w:t>这种增长虽然可能带来性能上的边际提升，但同时也导致了巨大的硬件资源开销以及漫长的训练与推理时间，使得这些先进模型难以直接部署于资源受限的边缘计算设备（如车载系统、无人机等）</w:t>
+        <w:t>这种增长虽然可能带来性能上的边际提升，但同时也导致了巨大的硬件资源开销以及漫长的训练与推理时间，使得这些先进模型难以直接部</w:t>
+      </w:r>
+      <w:r>
+        <w:rPr>
+          <w:rFonts w:ascii="宋体" w:hAnsi="宋体" w:cs="宋体" w:hint="eastAsia"/>
+          <w:kern w:val="0"/>
+          <w:sz w:val="24"/>
+        </w:rPr>
+        <w:lastRenderedPageBreak/>
+        <w:t>署于资源受限的边缘计算设备（如车载系统、无人机等）</w:t>
       </w:r>
       <w:r>
         <w:rPr>
@@ -9810,7 +9232,7 @@
     </w:p>
     <w:p>
       <w:pPr>
-        <w:spacing w:beforeLines="50" w:before="218" w:afterLines="50" w:after="218"/>
+        <w:spacing w:beforeLines="50" w:before="218" w:afterLines="50" w:after="218" w:line="360" w:lineRule="auto"/>
         <w:ind w:firstLineChars="200" w:firstLine="480"/>
         <w:jc w:val="both"/>
         <w:rPr>
@@ -10076,7 +9498,7 @@
     </w:p>
     <w:p>
       <w:pPr>
-        <w:spacing w:beforeLines="50" w:before="218" w:afterLines="50" w:after="218"/>
+        <w:spacing w:beforeLines="50" w:before="218" w:afterLines="50" w:after="218" w:line="360" w:lineRule="auto"/>
         <w:ind w:firstLineChars="200" w:firstLine="480"/>
         <w:jc w:val="both"/>
         <w:rPr>
@@ -10306,9 +9728,10 @@
     <w:p>
       <w:pPr>
         <w:pStyle w:val="EndNoteBibliography"/>
+        <w:spacing w:line="360" w:lineRule="auto"/>
         <w:ind w:left="720" w:hanging="720"/>
         <w:rPr>
-          <w:rFonts w:ascii="黑体" w:eastAsia="黑体" w:hAnsi="黑体"/>
+          <w:rFonts w:ascii="黑体" w:eastAsia="黑体" w:hAnsi="黑体" w:hint="eastAsia"/>
           <w:color w:val="000000" w:themeColor="text1"/>
           <w:sz w:val="32"/>
           <w:szCs w:val="32"/>
@@ -10321,6 +9744,7 @@
           <w:sz w:val="32"/>
           <w:szCs w:val="32"/>
         </w:rPr>
+        <w:lastRenderedPageBreak/>
         <w:t>参考文献</w:t>
       </w:r>
     </w:p>
@@ -10328,6 +9752,7 @@
       <w:pPr>
         <w:pStyle w:val="EndNoteBibliography"/>
         <w:ind w:left="720" w:hanging="720"/>
+        <w:jc w:val="both"/>
         <w:rPr>
           <w:noProof/>
         </w:rPr>
@@ -10363,6 +9788,7 @@
       <w:pPr>
         <w:pStyle w:val="EndNoteBibliography"/>
         <w:ind w:left="720" w:hanging="720"/>
+        <w:jc w:val="both"/>
         <w:rPr>
           <w:noProof/>
         </w:rPr>
@@ -10398,6 +9824,7 @@
       <w:pPr>
         <w:pStyle w:val="EndNoteBibliography"/>
         <w:ind w:left="720" w:hanging="720"/>
+        <w:jc w:val="both"/>
         <w:rPr>
           <w:noProof/>
         </w:rPr>
@@ -10420,7 +9847,7 @@
           <w:rFonts w:hint="eastAsia"/>
           <w:noProof/>
         </w:rPr>
-        <w:t xml:space="preserve">   </w:t>
+        <w:t xml:space="preserve">  </w:t>
       </w:r>
       <w:r>
         <w:rPr>
@@ -10433,6 +9860,7 @@
       <w:pPr>
         <w:pStyle w:val="EndNoteBibliography"/>
         <w:ind w:left="720" w:hanging="720"/>
+        <w:jc w:val="both"/>
         <w:rPr>
           <w:noProof/>
         </w:rPr>
@@ -10468,6 +9896,7 @@
       <w:pPr>
         <w:pStyle w:val="EndNoteBibliography"/>
         <w:ind w:left="720" w:hanging="720"/>
+        <w:jc w:val="both"/>
         <w:rPr>
           <w:noProof/>
         </w:rPr>
@@ -10503,6 +9932,7 @@
       <w:pPr>
         <w:pStyle w:val="EndNoteBibliography"/>
         <w:ind w:left="720" w:hanging="720"/>
+        <w:jc w:val="both"/>
         <w:rPr>
           <w:noProof/>
         </w:rPr>
@@ -10538,6 +9968,7 @@
       <w:pPr>
         <w:pStyle w:val="EndNoteBibliography"/>
         <w:ind w:left="720" w:hanging="720"/>
+        <w:jc w:val="both"/>
         <w:rPr>
           <w:noProof/>
         </w:rPr>
@@ -10573,6 +10004,7 @@
       <w:pPr>
         <w:pStyle w:val="EndNoteBibliography"/>
         <w:ind w:left="720" w:hanging="720"/>
+        <w:jc w:val="both"/>
         <w:rPr>
           <w:noProof/>
         </w:rPr>
@@ -10595,7 +10027,7 @@
           <w:rFonts w:hint="eastAsia"/>
           <w:noProof/>
         </w:rPr>
-        <w:t xml:space="preserve">   </w:t>
+        <w:t xml:space="preserve"> </w:t>
       </w:r>
       <w:r>
         <w:rPr>
@@ -10608,6 +10040,7 @@
       <w:pPr>
         <w:pStyle w:val="EndNoteBibliography"/>
         <w:ind w:left="720" w:hanging="720"/>
+        <w:jc w:val="both"/>
         <w:rPr>
           <w:noProof/>
         </w:rPr>
@@ -10649,6 +10082,7 @@
       <w:pPr>
         <w:pStyle w:val="EndNoteBibliography"/>
         <w:ind w:left="720" w:hanging="720"/>
+        <w:jc w:val="both"/>
         <w:rPr>
           <w:noProof/>
         </w:rPr>
@@ -10684,6 +10118,7 @@
       <w:pPr>
         <w:pStyle w:val="EndNoteBibliography"/>
         <w:ind w:left="720" w:hanging="720"/>
+        <w:jc w:val="both"/>
         <w:rPr>
           <w:noProof/>
         </w:rPr>
@@ -10719,6 +10154,7 @@
       <w:pPr>
         <w:pStyle w:val="EndNoteBibliography"/>
         <w:ind w:left="720" w:hanging="720"/>
+        <w:jc w:val="both"/>
         <w:rPr>
           <w:noProof/>
         </w:rPr>
@@ -10735,13 +10171,6 @@
           <w:noProof/>
         </w:rPr>
         <w:t xml:space="preserve"> </w:t>
-      </w:r>
-      <w:r>
-        <w:rPr>
-          <w:rFonts w:hint="eastAsia"/>
-          <w:noProof/>
-        </w:rPr>
-        <w:t xml:space="preserve">  </w:t>
       </w:r>
       <w:r>
         <w:rPr>
@@ -10754,6 +10183,7 @@
       <w:pPr>
         <w:pStyle w:val="EndNoteBibliography"/>
         <w:ind w:left="720" w:hanging="720"/>
+        <w:jc w:val="both"/>
         <w:rPr>
           <w:noProof/>
         </w:rPr>
@@ -10770,13 +10200,6 @@
           <w:noProof/>
         </w:rPr>
         <w:t xml:space="preserve"> </w:t>
-      </w:r>
-      <w:r>
-        <w:rPr>
-          <w:rFonts w:hint="eastAsia"/>
-          <w:noProof/>
-        </w:rPr>
-        <w:t xml:space="preserve">  </w:t>
       </w:r>
       <w:r>
         <w:rPr>
@@ -10789,6 +10212,7 @@
       <w:pPr>
         <w:pStyle w:val="EndNoteBibliography"/>
         <w:ind w:left="720" w:hanging="720"/>
+        <w:jc w:val="both"/>
         <w:rPr>
           <w:noProof/>
         </w:rPr>
@@ -10824,14 +10248,16 @@
       <w:pPr>
         <w:pStyle w:val="EndNoteBibliography"/>
         <w:ind w:left="720" w:hanging="720"/>
-        <w:rPr>
-          <w:noProof/>
-        </w:rPr>
-      </w:pPr>
-      <w:r>
-        <w:rPr>
-          <w:noProof/>
-        </w:rPr>
+        <w:jc w:val="both"/>
+        <w:rPr>
+          <w:noProof/>
+        </w:rPr>
+      </w:pPr>
+      <w:r>
+        <w:rPr>
+          <w:noProof/>
+        </w:rPr>
+        <w:lastRenderedPageBreak/>
         <w:t xml:space="preserve">[15] </w:t>
       </w:r>
       <w:r>
@@ -10859,6 +10285,7 @@
       <w:pPr>
         <w:pStyle w:val="EndNoteBibliography"/>
         <w:ind w:left="720" w:hanging="720"/>
+        <w:jc w:val="both"/>
         <w:rPr>
           <w:noProof/>
         </w:rPr>
@@ -10875,13 +10302,6 @@
           <w:noProof/>
         </w:rPr>
         <w:t xml:space="preserve"> </w:t>
-      </w:r>
-      <w:r>
-        <w:rPr>
-          <w:rFonts w:hint="eastAsia"/>
-          <w:noProof/>
-        </w:rPr>
-        <w:t xml:space="preserve">  </w:t>
       </w:r>
       <w:r>
         <w:rPr>
@@ -10894,6 +10314,7 @@
       <w:pPr>
         <w:pStyle w:val="EndNoteBibliography"/>
         <w:ind w:left="720" w:hanging="720"/>
+        <w:jc w:val="both"/>
         <w:rPr>
           <w:noProof/>
         </w:rPr>
@@ -10929,6 +10350,7 @@
       <w:pPr>
         <w:pStyle w:val="EndNoteBibliography"/>
         <w:ind w:left="720" w:hanging="720"/>
+        <w:jc w:val="both"/>
         <w:rPr>
           <w:noProof/>
         </w:rPr>
@@ -10964,6 +10386,7 @@
       <w:pPr>
         <w:pStyle w:val="EndNoteBibliography"/>
         <w:ind w:left="720" w:hanging="720"/>
+        <w:jc w:val="both"/>
         <w:rPr>
           <w:noProof/>
         </w:rPr>
@@ -10999,6 +10422,7 @@
       <w:pPr>
         <w:pStyle w:val="EndNoteBibliography"/>
         <w:ind w:left="720" w:hanging="720"/>
+        <w:jc w:val="both"/>
         <w:rPr>
           <w:noProof/>
         </w:rPr>
@@ -11034,6 +10458,7 @@
       <w:pPr>
         <w:pStyle w:val="EndNoteBibliography"/>
         <w:ind w:left="720" w:hanging="720"/>
+        <w:jc w:val="both"/>
         <w:rPr>
           <w:noProof/>
         </w:rPr>
@@ -11069,6 +10494,7 @@
       <w:pPr>
         <w:pStyle w:val="EndNoteBibliography"/>
         <w:ind w:left="720" w:hanging="720"/>
+        <w:jc w:val="both"/>
         <w:rPr>
           <w:noProof/>
         </w:rPr>
@@ -11104,6 +10530,7 @@
       <w:pPr>
         <w:pStyle w:val="EndNoteBibliography"/>
         <w:ind w:left="720" w:hanging="720"/>
+        <w:jc w:val="both"/>
         <w:rPr>
           <w:noProof/>
         </w:rPr>
@@ -11139,6 +10566,7 @@
       <w:pPr>
         <w:pStyle w:val="EndNoteBibliography"/>
         <w:ind w:left="720" w:hanging="720"/>
+        <w:jc w:val="both"/>
         <w:rPr>
           <w:noProof/>
         </w:rPr>
@@ -11174,6 +10602,7 @@
       <w:pPr>
         <w:pStyle w:val="EndNoteBibliography"/>
         <w:ind w:left="720" w:hanging="720"/>
+        <w:jc w:val="both"/>
         <w:rPr>
           <w:noProof/>
         </w:rPr>
@@ -11209,6 +10638,7 @@
       <w:pPr>
         <w:pStyle w:val="EndNoteBibliography"/>
         <w:ind w:left="720" w:hanging="720"/>
+        <w:jc w:val="both"/>
         <w:rPr>
           <w:noProof/>
         </w:rPr>
@@ -11244,6 +10674,7 @@
       <w:pPr>
         <w:pStyle w:val="EndNoteBibliography"/>
         <w:ind w:left="720" w:hanging="720"/>
+        <w:jc w:val="both"/>
         <w:rPr>
           <w:noProof/>
         </w:rPr>
@@ -11279,6 +10710,7 @@
       <w:pPr>
         <w:pStyle w:val="EndNoteBibliography"/>
         <w:ind w:left="720" w:hanging="720"/>
+        <w:jc w:val="both"/>
         <w:rPr>
           <w:noProof/>
         </w:rPr>
@@ -11314,14 +10746,16 @@
       <w:pPr>
         <w:pStyle w:val="EndNoteBibliography"/>
         <w:ind w:left="720" w:hanging="720"/>
-        <w:rPr>
-          <w:noProof/>
-        </w:rPr>
-      </w:pPr>
-      <w:r>
-        <w:rPr>
-          <w:noProof/>
-        </w:rPr>
+        <w:jc w:val="both"/>
+        <w:rPr>
+          <w:noProof/>
+        </w:rPr>
+      </w:pPr>
+      <w:r>
+        <w:rPr>
+          <w:noProof/>
+        </w:rPr>
+        <w:lastRenderedPageBreak/>
         <w:t xml:space="preserve">[29] </w:t>
       </w:r>
       <w:r>
@@ -11349,6 +10783,7 @@
       <w:pPr>
         <w:pStyle w:val="EndNoteBibliography"/>
         <w:ind w:left="720" w:hanging="720"/>
+        <w:jc w:val="both"/>
         <w:rPr>
           <w:noProof/>
         </w:rPr>
@@ -11384,6 +10819,7 @@
       <w:pPr>
         <w:pStyle w:val="EndNoteBibliography"/>
         <w:ind w:left="720" w:hanging="720"/>
+        <w:jc w:val="both"/>
         <w:rPr>
           <w:noProof/>
         </w:rPr>
@@ -11419,6 +10855,7 @@
       <w:pPr>
         <w:pStyle w:val="EndNoteBibliography"/>
         <w:ind w:left="720" w:hanging="720"/>
+        <w:jc w:val="both"/>
         <w:rPr>
           <w:noProof/>
         </w:rPr>
@@ -11454,6 +10891,7 @@
       <w:pPr>
         <w:pStyle w:val="EndNoteBibliography"/>
         <w:ind w:left="720" w:hanging="720"/>
+        <w:jc w:val="both"/>
         <w:rPr>
           <w:noProof/>
         </w:rPr>
@@ -11476,7 +10914,7 @@
           <w:rFonts w:hint="eastAsia"/>
           <w:noProof/>
         </w:rPr>
-        <w:t xml:space="preserve">  </w:t>
+        <w:t xml:space="preserve"> </w:t>
       </w:r>
       <w:r>
         <w:rPr>
@@ -11489,6 +10927,7 @@
       <w:pPr>
         <w:pStyle w:val="EndNoteBibliography"/>
         <w:ind w:left="720" w:hanging="720"/>
+        <w:jc w:val="both"/>
         <w:rPr>
           <w:noProof/>
         </w:rPr>
@@ -11511,7 +10950,7 @@
           <w:rFonts w:hint="eastAsia"/>
           <w:noProof/>
         </w:rPr>
-        <w:t xml:space="preserve">  </w:t>
+        <w:t xml:space="preserve"> </w:t>
       </w:r>
       <w:r>
         <w:rPr>
@@ -11524,6 +10963,7 @@
       <w:pPr>
         <w:pStyle w:val="EndNoteBibliography"/>
         <w:ind w:left="720" w:hanging="720"/>
+        <w:jc w:val="both"/>
         <w:rPr>
           <w:noProof/>
         </w:rPr>
@@ -11559,6 +10999,7 @@
       <w:pPr>
         <w:pStyle w:val="EndNoteBibliography"/>
         <w:ind w:left="720" w:hanging="720"/>
+        <w:jc w:val="both"/>
         <w:rPr>
           <w:noProof/>
         </w:rPr>
@@ -11594,6 +11035,7 @@
       <w:pPr>
         <w:pStyle w:val="EndNoteBibliography"/>
         <w:ind w:left="720" w:hanging="720"/>
+        <w:jc w:val="both"/>
         <w:rPr>
           <w:noProof/>
         </w:rPr>
@@ -11629,6 +11071,7 @@
       <w:pPr>
         <w:pStyle w:val="EndNoteBibliography"/>
         <w:ind w:left="720" w:hanging="720"/>
+        <w:jc w:val="both"/>
         <w:rPr>
           <w:noProof/>
         </w:rPr>
@@ -11664,6 +11107,7 @@
       <w:pPr>
         <w:pStyle w:val="EndNoteBibliography"/>
         <w:ind w:left="720" w:hanging="720"/>
+        <w:jc w:val="both"/>
         <w:rPr>
           <w:noProof/>
         </w:rPr>
@@ -11699,6 +11143,7 @@
       <w:pPr>
         <w:pStyle w:val="EndNoteBibliography"/>
         <w:ind w:left="720" w:hanging="720"/>
+        <w:jc w:val="both"/>
         <w:rPr>
           <w:noProof/>
         </w:rPr>
@@ -11734,6 +11179,7 @@
       <w:pPr>
         <w:pStyle w:val="EndNoteBibliography"/>
         <w:ind w:left="720" w:hanging="720"/>
+        <w:jc w:val="both"/>
         <w:rPr>
           <w:noProof/>
         </w:rPr>
@@ -11769,6 +11215,7 @@
       <w:pPr>
         <w:pStyle w:val="EndNoteBibliography"/>
         <w:ind w:left="720" w:hanging="720"/>
+        <w:jc w:val="both"/>
         <w:rPr>
           <w:noProof/>
         </w:rPr>
@@ -11804,6 +11251,7 @@
       <w:pPr>
         <w:pStyle w:val="EndNoteBibliography"/>
         <w:ind w:left="720" w:hanging="720"/>
+        <w:jc w:val="both"/>
         <w:rPr>
           <w:noProof/>
         </w:rPr>
@@ -11839,14 +11287,16 @@
       <w:pPr>
         <w:pStyle w:val="EndNoteBibliography"/>
         <w:ind w:left="720" w:hanging="720"/>
-        <w:rPr>
-          <w:noProof/>
-        </w:rPr>
-      </w:pPr>
-      <w:r>
-        <w:rPr>
-          <w:noProof/>
-        </w:rPr>
+        <w:jc w:val="both"/>
+        <w:rPr>
+          <w:noProof/>
+        </w:rPr>
+      </w:pPr>
+      <w:r>
+        <w:rPr>
+          <w:noProof/>
+        </w:rPr>
+        <w:lastRenderedPageBreak/>
         <w:t xml:space="preserve">[44] </w:t>
       </w:r>
       <w:r>
@@ -11861,7 +11311,7 @@
           <w:rFonts w:hint="eastAsia"/>
           <w:noProof/>
         </w:rPr>
-        <w:t xml:space="preserve">  </w:t>
+        <w:t xml:space="preserve"> </w:t>
       </w:r>
       <w:r>
         <w:rPr>
@@ -11874,6 +11324,7 @@
       <w:pPr>
         <w:pStyle w:val="EndNoteBibliography"/>
         <w:ind w:left="720" w:hanging="720"/>
+        <w:jc w:val="both"/>
         <w:rPr>
           <w:noProof/>
         </w:rPr>
@@ -11896,7 +11347,7 @@
           <w:rFonts w:hint="eastAsia"/>
           <w:noProof/>
         </w:rPr>
-        <w:t xml:space="preserve">  </w:t>
+        <w:t xml:space="preserve"> </w:t>
       </w:r>
       <w:r>
         <w:rPr>

</xml_diff>